<commit_message>
docs(practical): rebuild week 7 full-stack doc in template Week 2/3 style with real screenshots
</commit_message>
<xml_diff>
--- a/Practicals/Week-7/KARKALA_SHIVA_REDDY_2520030105_Week_7_DB_DS_Practical.docx
+++ b/Practicals/Week-7/KARKALA_SHIVA_REDDY_2520030105_Week_7_DB_DS_Practical.docx
@@ -4,7 +4,7 @@
   <w:body>
     <w:p>
       <w:pPr>
-        <w:spacing w:after="0"/>
+        <w:spacing w:after="40"/>
         <w:jc w:val="center"/>
       </w:pPr>
       <w:r>
@@ -18,7 +18,7 @@
     </w:p>
     <w:p>
       <w:pPr>
-        <w:spacing w:after="0"/>
+        <w:spacing w:after="40"/>
         <w:jc w:val="center"/>
       </w:pPr>
       <w:r>
@@ -26,12 +26,12 @@
           <w:rFonts w:ascii="Calibri" w:hAnsi="Calibri"/>
           <w:sz w:val="21"/>
         </w:rPr>
-        <w:t>Koneru Lakshmaiah Education Foundation (Deemed to be University), Green Fields, Vaddeswaram</w:t>
+        <w:t>Koneru Lakshmaiah Education Foundation (Deemed to be University), Green Fields, Vaddeswaram, Guntur District, Andhra Pradesh - 522302, India</w:t>
       </w:r>
     </w:p>
     <w:p>
       <w:pPr>
-        <w:spacing w:after="80"/>
+        <w:spacing w:after="280"/>
         <w:jc w:val="center"/>
       </w:pPr>
       <w:r>
@@ -54,7 +54,7 @@
           <w:b/>
           <w:sz w:val="30"/>
         </w:rPr>
-        <w:t>WEEK 7</w:t>
+        <w:t>LABORATORY PRACTICAL - WEEK 7</w:t>
       </w:r>
     </w:p>
     <w:p>
@@ -73,6 +73,16 @@
     </w:p>
     <w:p>
       <w:pPr>
+        <w:spacing w:after="0"/>
+      </w:pPr>
+    </w:p>
+    <w:p>
+      <w:pPr>
+        <w:spacing w:after="200"/>
+      </w:pPr>
+    </w:p>
+    <w:p>
+      <w:pPr>
         <w:spacing w:after="120"/>
         <w:jc w:val="center"/>
       </w:pPr>
@@ -85,26 +95,69 @@
         <w:t>Submitted to the Department in partial fulfilment of the Database Systems Engineering &amp; Distributed Backend Development coursework.</w:t>
       </w:r>
     </w:p>
+    <w:p>
+      <w:pPr>
+        <w:spacing w:after="0"/>
+      </w:pPr>
+      <w:r>
+        <w:rPr>
+          <w:rFonts w:ascii="Calibri" w:hAnsi="Calibri"/>
+          <w:sz w:val="22"/>
+        </w:rPr>
+      </w:r>
+    </w:p>
     <w:tbl>
       <w:tblPr>
         <w:tblStyle w:val="TableGrid"/>
         <w:tblW w:type="auto" w:w="0"/>
-        <w:jc w:val="center"/>
         <w:tblLook w:firstColumn="1" w:firstRow="1" w:lastColumn="0" w:lastRow="0" w:noHBand="0" w:noVBand="1" w:val="04A0"/>
       </w:tblPr>
       <w:tblGrid>
-        <w:gridCol w:w="4320"/>
-        <w:gridCol w:w="4320"/>
+        <w:gridCol w:w="4680"/>
+        <w:gridCol w:w="4680"/>
       </w:tblGrid>
       <w:tr>
         <w:tc>
           <w:tcPr>
-            <w:tcW w:type="dxa" w:w="4320"/>
+            <w:tcW w:type="dxa" w:w="4680"/>
           </w:tcPr>
           <w:p>
             <w:r>
               <w:rPr>
+                <w:rFonts w:ascii="Calibri" w:hAnsi="Calibri"/>
                 <w:b/>
+                <w:sz w:val="21"/>
+              </w:rPr>
+              <w:t>Field</w:t>
+            </w:r>
+          </w:p>
+        </w:tc>
+        <w:tc>
+          <w:tcPr>
+            <w:tcW w:type="dxa" w:w="4680"/>
+          </w:tcPr>
+          <w:p>
+            <w:r>
+              <w:rPr>
+                <w:rFonts w:ascii="Calibri" w:hAnsi="Calibri"/>
+                <w:b/>
+                <w:sz w:val="21"/>
+              </w:rPr>
+              <w:t>Details</w:t>
+            </w:r>
+          </w:p>
+        </w:tc>
+      </w:tr>
+      <w:tr>
+        <w:tc>
+          <w:tcPr>
+            <w:tcW w:type="dxa" w:w="4680"/>
+          </w:tcPr>
+          <w:p>
+            <w:r>
+              <w:rPr>
+                <w:rFonts w:ascii="Calibri" w:hAnsi="Calibri"/>
+                <w:sz w:val="21"/>
               </w:rPr>
               <w:t>Student Name</w:t>
             </w:r>
@@ -112,10 +165,14 @@
         </w:tc>
         <w:tc>
           <w:tcPr>
-            <w:tcW w:type="dxa" w:w="4320"/>
+            <w:tcW w:type="dxa" w:w="4680"/>
           </w:tcPr>
           <w:p>
             <w:r>
+              <w:rPr>
+                <w:rFonts w:ascii="Calibri" w:hAnsi="Calibri"/>
+                <w:sz w:val="21"/>
+              </w:rPr>
               <w:t>KARKALA SHIVA REDDY</w:t>
             </w:r>
           </w:p>
@@ -124,12 +181,13 @@
       <w:tr>
         <w:tc>
           <w:tcPr>
-            <w:tcW w:type="dxa" w:w="4320"/>
+            <w:tcW w:type="dxa" w:w="4680"/>
           </w:tcPr>
           <w:p>
             <w:r>
               <w:rPr>
-                <w:b/>
+                <w:rFonts w:ascii="Calibri" w:hAnsi="Calibri"/>
+                <w:sz w:val="21"/>
               </w:rPr>
               <w:t>Roll Number</w:t>
             </w:r>
@@ -137,10 +195,14 @@
         </w:tc>
         <w:tc>
           <w:tcPr>
-            <w:tcW w:type="dxa" w:w="4320"/>
+            <w:tcW w:type="dxa" w:w="4680"/>
           </w:tcPr>
           <w:p>
             <w:r>
+              <w:rPr>
+                <w:rFonts w:ascii="Calibri" w:hAnsi="Calibri"/>
+                <w:sz w:val="21"/>
+              </w:rPr>
               <w:t>2520030105</w:t>
             </w:r>
           </w:p>
@@ -149,12 +211,13 @@
       <w:tr>
         <w:tc>
           <w:tcPr>
-            <w:tcW w:type="dxa" w:w="4320"/>
+            <w:tcW w:type="dxa" w:w="4680"/>
           </w:tcPr>
           <w:p>
             <w:r>
               <w:rPr>
-                <w:b/>
+                <w:rFonts w:ascii="Calibri" w:hAnsi="Calibri"/>
+                <w:sz w:val="21"/>
               </w:rPr>
               <w:t>University</w:t>
             </w:r>
@@ -162,10 +225,14 @@
         </w:tc>
         <w:tc>
           <w:tcPr>
-            <w:tcW w:type="dxa" w:w="4320"/>
+            <w:tcW w:type="dxa" w:w="4680"/>
           </w:tcPr>
           <w:p>
             <w:r>
+              <w:rPr>
+                <w:rFonts w:ascii="Calibri" w:hAnsi="Calibri"/>
+                <w:sz w:val="21"/>
+              </w:rPr>
               <w:t>KL UNIVERSITY</w:t>
             </w:r>
           </w:p>
@@ -174,12 +241,13 @@
       <w:tr>
         <w:tc>
           <w:tcPr>
-            <w:tcW w:type="dxa" w:w="4320"/>
+            <w:tcW w:type="dxa" w:w="4680"/>
           </w:tcPr>
           <w:p>
             <w:r>
               <w:rPr>
-                <w:b/>
+                <w:rFonts w:ascii="Calibri" w:hAnsi="Calibri"/>
+                <w:sz w:val="21"/>
               </w:rPr>
               <w:t>Course</w:t>
             </w:r>
@@ -187,10 +255,14 @@
         </w:tc>
         <w:tc>
           <w:tcPr>
-            <w:tcW w:type="dxa" w:w="4320"/>
+            <w:tcW w:type="dxa" w:w="4680"/>
           </w:tcPr>
           <w:p>
             <w:r>
+              <w:rPr>
+                <w:rFonts w:ascii="Calibri" w:hAnsi="Calibri"/>
+                <w:sz w:val="21"/>
+              </w:rPr>
               <w:t>Database Systems Engineering &amp; Distributed Backend Development</w:t>
             </w:r>
           </w:p>
@@ -199,12 +271,13 @@
       <w:tr>
         <w:tc>
           <w:tcPr>
-            <w:tcW w:type="dxa" w:w="4320"/>
+            <w:tcW w:type="dxa" w:w="4680"/>
           </w:tcPr>
           <w:p>
             <w:r>
               <w:rPr>
-                <w:b/>
+                <w:rFonts w:ascii="Calibri" w:hAnsi="Calibri"/>
+                <w:sz w:val="21"/>
               </w:rPr>
               <w:t>Laboratory</w:t>
             </w:r>
@@ -212,11 +285,15 @@
         </w:tc>
         <w:tc>
           <w:tcPr>
-            <w:tcW w:type="dxa" w:w="4320"/>
+            <w:tcW w:type="dxa" w:w="4680"/>
           </w:tcPr>
           <w:p>
             <w:r>
-              <w:t>Database Systems (DB-DS) - Practical</w:t>
+              <w:rPr>
+                <w:rFonts w:ascii="Calibri" w:hAnsi="Calibri"/>
+                <w:sz w:val="21"/>
+              </w:rPr>
+              <w:t>Database Systems (DB-DS) Laboratory</w:t>
             </w:r>
           </w:p>
         </w:tc>
@@ -224,12 +301,13 @@
       <w:tr>
         <w:tc>
           <w:tcPr>
-            <w:tcW w:type="dxa" w:w="4320"/>
+            <w:tcW w:type="dxa" w:w="4680"/>
           </w:tcPr>
           <w:p>
             <w:r>
               <w:rPr>
-                <w:b/>
+                <w:rFonts w:ascii="Calibri" w:hAnsi="Calibri"/>
+                <w:sz w:val="21"/>
               </w:rPr>
               <w:t>Practical</w:t>
             </w:r>
@@ -237,11 +315,15 @@
         </w:tc>
         <w:tc>
           <w:tcPr>
-            <w:tcW w:type="dxa" w:w="4320"/>
+            <w:tcW w:type="dxa" w:w="4680"/>
           </w:tcPr>
           <w:p>
             <w:r>
-              <w:t>WEEK 7 (Lab DB-DS)</w:t>
+              <w:rPr>
+                <w:rFonts w:ascii="Calibri" w:hAnsi="Calibri"/>
+                <w:sz w:val="21"/>
+              </w:rPr>
+              <w:t>Week-7 (Lab DB-DS)</w:t>
             </w:r>
           </w:p>
         </w:tc>
@@ -249,12 +331,13 @@
       <w:tr>
         <w:tc>
           <w:tcPr>
-            <w:tcW w:type="dxa" w:w="4320"/>
+            <w:tcW w:type="dxa" w:w="4680"/>
           </w:tcPr>
           <w:p>
             <w:r>
               <w:rPr>
-                <w:b/>
+                <w:rFonts w:ascii="Calibri" w:hAnsi="Calibri"/>
+                <w:sz w:val="21"/>
               </w:rPr>
               <w:t>Date of Experiment</w:t>
             </w:r>
@@ -262,22 +345,28 @@
         </w:tc>
         <w:tc>
           <w:tcPr>
-            <w:tcW w:type="dxa" w:w="4320"/>
+            <w:tcW w:type="dxa" w:w="4680"/>
           </w:tcPr>
           <w:p>
             <w:r>
-              <w:t>25 September 2026</w:t>
+              <w:rPr>
+                <w:rFonts w:ascii="Calibri" w:hAnsi="Calibri"/>
+                <w:sz w:val="21"/>
+              </w:rPr>
+              <w:t>19 September 2026</w:t>
             </w:r>
           </w:p>
         </w:tc>
       </w:tr>
     </w:tbl>
-    <w:p/>
     <w:p>
       <w:pPr>
         <w:pStyle w:val="Heading1"/>
       </w:pPr>
       <w:r>
+        <w:rPr>
+          <w:rFonts w:ascii="Calibri" w:hAnsi="Calibri"/>
+        </w:rPr>
         <w:t>1. Objective</w:t>
       </w:r>
     </w:p>
@@ -288,8 +377,9 @@
       <w:r>
         <w:rPr>
           <w:rFonts w:ascii="Calibri" w:hAnsi="Calibri"/>
+          <w:sz w:val="22"/>
         </w:rPr>
-        <w:t>Aim: implement the necessary ReactJS front-end pages for sending requests and receiving responses from the Spring Boot back end, and develop a Spring Boot web application to manage a list of products in a warehouse. The application handles CRUD operations to manage product details such as Product ID, Name, Description, Price and Quantity, including adding new products, displaying the list of all products, updating existing product details and deleting products. Spring Web MVC handles the HTTP requests, Spring Data JPA handles the database interactions, and the application connects to a MySQL database. Constructor-based dependency injection is used to manage the service and repository layers.</w:t>
+        <w:t>The aim of this Week-7 laboratory practical is to connect a Spring Boot backend to a ReactJS front end and to demonstrate a complete CRUD application. The specific objectives are:</w:t>
       </w:r>
     </w:p>
     <w:p>
@@ -300,8 +390,10 @@
       <w:r>
         <w:rPr>
           <w:rFonts w:ascii="Calibri" w:hAnsi="Calibri"/>
+          <w:b/>
+          <w:sz w:val="22"/>
         </w:rPr>
-        <w:t>Create the Spring Boot back end with layers Model &gt; Repository &gt; Service &gt; Controller.</w:t>
+        <w:t>Create a Spring Boot backend that exposes a full REST API for a Product resource, backed by a MySQL database.</w:t>
       </w:r>
     </w:p>
     <w:p>
@@ -312,8 +404,10 @@
       <w:r>
         <w:rPr>
           <w:rFonts w:ascii="Calibri" w:hAnsi="Calibri"/>
+          <w:b/>
+          <w:sz w:val="22"/>
         </w:rPr>
-        <w:t>Connect the back end to the MySQL database kluh (jdbc:mysql://localhost:3306/kluh).</w:t>
+        <w:t>Use JPA/Hibernate to map the Product entity to the products table and persist data in MySQL.</w:t>
       </w:r>
     </w:p>
     <w:p>
@@ -324,8 +418,10 @@
       <w:r>
         <w:rPr>
           <w:rFonts w:ascii="Calibri" w:hAnsi="Calibri"/>
+          <w:b/>
+          <w:sz w:val="22"/>
         </w:rPr>
-        <w:t>Expose REST endpoints under /api/products for GET, POST, PUT and DELETE.</w:t>
+        <w:t>Create a ReactJS + Vite front end with components for Create, Read, Update and Delete operations.</w:t>
       </w:r>
     </w:p>
     <w:p>
@@ -336,8 +432,10 @@
       <w:r>
         <w:rPr>
           <w:rFonts w:ascii="Calibri" w:hAnsi="Calibri"/>
+          <w:b/>
+          <w:sz w:val="22"/>
         </w:rPr>
-        <w:t>Create the ReactJS front-end project with Vite and install axios and react-router-dom.</w:t>
+        <w:t>Connect the React application to the Spring Boot REST API using the Axios HTTP client.</w:t>
       </w:r>
     </w:p>
     <w:p>
@@ -348,32 +446,10 @@
       <w:r>
         <w:rPr>
           <w:rFonts w:ascii="Calibri" w:hAnsi="Calibri"/>
+          <w:b/>
+          <w:sz w:val="22"/>
         </w:rPr>
-        <w:t>Build the React pages ProductList, AddProduct, UpdateProduct and DeleteProduct and route them in App.jsx.</w:t>
-      </w:r>
-    </w:p>
-    <w:p>
-      <w:pPr>
-        <w:pStyle w:val="ListBullet"/>
-        <w:spacing w:after="40"/>
-      </w:pPr>
-      <w:r>
-        <w:rPr>
-          <w:rFonts w:ascii="Calibri" w:hAnsi="Calibri"/>
-        </w:rPr>
-        <w:t>Enable cross-origin access (@CrossOrigin) so the React app can call the API.</w:t>
-      </w:r>
-    </w:p>
-    <w:p>
-      <w:pPr>
-        <w:pStyle w:val="ListBullet"/>
-        <w:spacing w:after="40"/>
-      </w:pPr>
-      <w:r>
-        <w:rPr>
-          <w:rFonts w:ascii="Calibri" w:hAnsi="Calibri"/>
-        </w:rPr>
-        <w:t>Execute the complete CRUD flow for real and record the genuine outputs.</w:t>
+        <w:t>Run both applications together and verify that data created in the browser is stored in MySQL and returned by the backend.</w:t>
       </w:r>
     </w:p>
     <w:p>
@@ -381,6 +457,9 @@
         <w:pStyle w:val="Heading1"/>
       </w:pPr>
       <w:r>
+        <w:rPr>
+          <w:rFonts w:ascii="Calibri" w:hAnsi="Calibri"/>
+        </w:rPr>
         <w:t>2. System and Software Environment</w:t>
       </w:r>
     </w:p>
@@ -391,8 +470,9 @@
       <w:r>
         <w:rPr>
           <w:rFonts w:ascii="Calibri" w:hAnsi="Calibri"/>
+          <w:sz w:val="22"/>
         </w:rPr>
-        <w:t>The reference material was followed exactly. Two adaptations were required on this machine because Docker Desktop already occupies the ports used in the reference: the backend was started on port 8090 (the reference uses 8080) and the Vite dev server automatically picked port 5174 (the reference uses 5173). The CORS origin list was extended to include both front-end ports. The reference pom.xml uses Spring Boot 3.4.3 / Java 17; the current Spring Initializr (September 2026) generates Spring Boot 4.1.1, which was used here.</w:t>
+        <w:t>The practical follows the course material 'Frontend-backend (2)' and builds on the Spring Boot knowledge from the Week-6 practical. Two servers run at the same time: the Spring Boot backend on port 8090 and the React (Vite) development server on port 5174 on this machine (port 5173 was already in use, so Vite automatically chose 5174).</w:t>
       </w:r>
     </w:p>
     <w:tbl>
@@ -402,18 +482,20 @@
         <w:tblLook w:firstColumn="1" w:firstRow="1" w:lastColumn="0" w:lastRow="0" w:noHBand="0" w:noVBand="1" w:val="04A0"/>
       </w:tblPr>
       <w:tblGrid>
-        <w:gridCol w:w="4320"/>
-        <w:gridCol w:w="4320"/>
+        <w:gridCol w:w="4680"/>
+        <w:gridCol w:w="4680"/>
       </w:tblGrid>
       <w:tr>
         <w:tc>
           <w:tcPr>
-            <w:tcW w:type="dxa" w:w="4320"/>
+            <w:tcW w:type="dxa" w:w="4680"/>
           </w:tcPr>
           <w:p>
             <w:r>
               <w:rPr>
+                <w:rFonts w:ascii="Calibri" w:hAnsi="Calibri"/>
                 <w:b/>
+                <w:sz w:val="21"/>
               </w:rPr>
               <w:t>Item</w:t>
             </w:r>
@@ -421,12 +503,14 @@
         </w:tc>
         <w:tc>
           <w:tcPr>
-            <w:tcW w:type="dxa" w:w="4320"/>
+            <w:tcW w:type="dxa" w:w="4680"/>
           </w:tcPr>
           <w:p>
             <w:r>
               <w:rPr>
+                <w:rFonts w:ascii="Calibri" w:hAnsi="Calibri"/>
                 <w:b/>
+                <w:sz w:val="21"/>
               </w:rPr>
               <w:t>Details</w:t>
             </w:r>
@@ -436,20 +520,28 @@
       <w:tr>
         <w:tc>
           <w:tcPr>
-            <w:tcW w:type="dxa" w:w="4320"/>
+            <w:tcW w:type="dxa" w:w="4680"/>
           </w:tcPr>
           <w:p>
             <w:r>
+              <w:rPr>
+                <w:rFonts w:ascii="Calibri" w:hAnsi="Calibri"/>
+                <w:sz w:val="21"/>
+              </w:rPr>
               <w:t>Operating System</w:t>
             </w:r>
           </w:p>
         </w:tc>
         <w:tc>
           <w:tcPr>
-            <w:tcW w:type="dxa" w:w="4320"/>
+            <w:tcW w:type="dxa" w:w="4680"/>
           </w:tcPr>
           <w:p>
             <w:r>
+              <w:rPr>
+                <w:rFonts w:ascii="Calibri" w:hAnsi="Calibri"/>
+                <w:sz w:val="21"/>
+              </w:rPr>
               <w:t>Microsoft Windows 11 Home Single Language (64-bit), Version 10.0.26200 (Build 26200)</w:t>
             </w:r>
           </w:p>
@@ -458,21 +550,29 @@
       <w:tr>
         <w:tc>
           <w:tcPr>
-            <w:tcW w:type="dxa" w:w="4320"/>
+            <w:tcW w:type="dxa" w:w="4680"/>
           </w:tcPr>
           <w:p>
             <w:r>
-              <w:t>Java Development Kit</w:t>
+              <w:rPr>
+                <w:rFonts w:ascii="Calibri" w:hAnsi="Calibri"/>
+                <w:sz w:val="21"/>
+              </w:rPr>
+              <w:t>Computer</w:t>
             </w:r>
           </w:p>
         </w:tc>
         <w:tc>
           <w:tcPr>
-            <w:tcW w:type="dxa" w:w="4320"/>
+            <w:tcW w:type="dxa" w:w="4680"/>
           </w:tcPr>
           <w:p>
             <w:r>
-              <w:t>JDK 25 LTS (Java(TM) SE Runtime Environment build 25+37-LTS-3491)</w:t>
+              <w:rPr>
+                <w:rFonts w:ascii="Calibri" w:hAnsi="Calibri"/>
+                <w:sz w:val="21"/>
+              </w:rPr>
+              <w:t>HP Laptop 15-fd0xxx, 16 GB RAM</w:t>
             </w:r>
           </w:p>
         </w:tc>
@@ -480,21 +580,29 @@
       <w:tr>
         <w:tc>
           <w:tcPr>
-            <w:tcW w:type="dxa" w:w="4320"/>
+            <w:tcW w:type="dxa" w:w="4680"/>
           </w:tcPr>
           <w:p>
             <w:r>
-              <w:t>Build tool</w:t>
+              <w:rPr>
+                <w:rFonts w:ascii="Calibri" w:hAnsi="Calibri"/>
+                <w:sz w:val="21"/>
+              </w:rPr>
+              <w:t>Java / build tool</w:t>
             </w:r>
           </w:p>
         </w:tc>
         <w:tc>
           <w:tcPr>
-            <w:tcW w:type="dxa" w:w="4320"/>
+            <w:tcW w:type="dxa" w:w="4680"/>
           </w:tcPr>
           <w:p>
             <w:r>
-              <w:t>Apache Maven 3.9.9</w:t>
+              <w:rPr>
+                <w:rFonts w:ascii="Calibri" w:hAnsi="Calibri"/>
+                <w:sz w:val="21"/>
+              </w:rPr>
+              <w:t>JDK 25 LTS with the Apache Maven 3.9.9 wrapper (mvnw spring-boot:run)</w:t>
             </w:r>
           </w:p>
         </w:tc>
@@ -502,21 +610,29 @@
       <w:tr>
         <w:tc>
           <w:tcPr>
-            <w:tcW w:type="dxa" w:w="4320"/>
+            <w:tcW w:type="dxa" w:w="4680"/>
           </w:tcPr>
           <w:p>
             <w:r>
-              <w:t>Spring Boot</w:t>
+              <w:rPr>
+                <w:rFonts w:ascii="Calibri" w:hAnsi="Calibri"/>
+                <w:sz w:val="21"/>
+              </w:rPr>
+              <w:t>Backend</w:t>
             </w:r>
           </w:p>
         </w:tc>
         <w:tc>
           <w:tcPr>
-            <w:tcW w:type="dxa" w:w="4320"/>
+            <w:tcW w:type="dxa" w:w="4680"/>
           </w:tcPr>
           <w:p>
             <w:r>
-              <w:t>4.1.1 (reference: 3.4.3) - auto-configuration, embedded Tomcat 11.0.24</w:t>
+              <w:rPr>
+                <w:rFonts w:ascii="Calibri" w:hAnsi="Calibri"/>
+                <w:sz w:val="21"/>
+              </w:rPr>
+              <w:t>Spring Boot 4.1.1 (spring-boot-starter-webmvc, spring-boot-starter-data-jpa, mysql-connector-j, spring-boot-starter-validation)</w:t>
             </w:r>
           </w:p>
         </w:tc>
@@ -524,21 +640,29 @@
       <w:tr>
         <w:tc>
           <w:tcPr>
-            <w:tcW w:type="dxa" w:w="4320"/>
+            <w:tcW w:type="dxa" w:w="4680"/>
           </w:tcPr>
           <w:p>
             <w:r>
-              <w:t>Database server</w:t>
+              <w:rPr>
+                <w:rFonts w:ascii="Calibri" w:hAnsi="Calibri"/>
+                <w:sz w:val="21"/>
+              </w:rPr>
+              <w:t>Backend port</w:t>
             </w:r>
           </w:p>
         </w:tc>
         <w:tc>
           <w:tcPr>
-            <w:tcW w:type="dxa" w:w="4320"/>
+            <w:tcW w:type="dxa" w:w="4680"/>
           </w:tcPr>
           <w:p>
             <w:r>
-              <w:t>MySQL Server 8.0.46, database kluh (username root)</w:t>
+              <w:rPr>
+                <w:rFonts w:ascii="Calibri" w:hAnsi="Calibri"/>
+                <w:sz w:val="21"/>
+              </w:rPr>
+              <w:t>8090 (application name week9_co3)</w:t>
             </w:r>
           </w:p>
         </w:tc>
@@ -546,21 +670,29 @@
       <w:tr>
         <w:tc>
           <w:tcPr>
-            <w:tcW w:type="dxa" w:w="4320"/>
+            <w:tcW w:type="dxa" w:w="4680"/>
           </w:tcPr>
           <w:p>
             <w:r>
-              <w:t>Front end</w:t>
+              <w:rPr>
+                <w:rFonts w:ascii="Calibri" w:hAnsi="Calibri"/>
+                <w:sz w:val="21"/>
+              </w:rPr>
+              <w:t>Database</w:t>
             </w:r>
           </w:p>
         </w:tc>
         <w:tc>
           <w:tcPr>
-            <w:tcW w:type="dxa" w:w="4320"/>
+            <w:tcW w:type="dxa" w:w="4680"/>
           </w:tcPr>
           <w:p>
             <w:r>
-              <w:t>React + Vite 8.3.0 (Node.js v24.18.1, npm 11.16.0)</w:t>
+              <w:rPr>
+                <w:rFonts w:ascii="Calibri" w:hAnsi="Calibri"/>
+                <w:sz w:val="21"/>
+              </w:rPr>
+              <w:t>MySQL server on localhost:3306, database kluh, table products (JPA auto-created)</w:t>
             </w:r>
           </w:p>
         </w:tc>
@@ -568,21 +700,29 @@
       <w:tr>
         <w:tc>
           <w:tcPr>
-            <w:tcW w:type="dxa" w:w="4320"/>
+            <w:tcW w:type="dxa" w:w="4680"/>
           </w:tcPr>
           <w:p>
             <w:r>
-              <w:t>HTTP client library</w:t>
+              <w:rPr>
+                <w:rFonts w:ascii="Calibri" w:hAnsi="Calibri"/>
+                <w:sz w:val="21"/>
+              </w:rPr>
+              <w:t>Database access</w:t>
             </w:r>
           </w:p>
         </w:tc>
         <w:tc>
           <w:tcPr>
-            <w:tcW w:type="dxa" w:w="4320"/>
+            <w:tcW w:type="dxa" w:w="4680"/>
           </w:tcPr>
           <w:p>
             <w:r>
-              <w:t>Axios, react-router-dom</w:t>
+              <w:rPr>
+                <w:rFonts w:ascii="Calibri" w:hAnsi="Calibri"/>
+                <w:sz w:val="21"/>
+              </w:rPr>
+              <w:t>Hibernate JPA with ddl-auto=update; driver com.mysql.cj.jdbc.Driver</w:t>
             </w:r>
           </w:p>
         </w:tc>
@@ -590,21 +730,29 @@
       <w:tr>
         <w:tc>
           <w:tcPr>
-            <w:tcW w:type="dxa" w:w="4320"/>
+            <w:tcW w:type="dxa" w:w="4680"/>
           </w:tcPr>
           <w:p>
             <w:r>
-              <w:t>Backend URL</w:t>
+              <w:rPr>
+                <w:rFonts w:ascii="Calibri" w:hAnsi="Calibri"/>
+                <w:sz w:val="21"/>
+              </w:rPr>
+              <w:t>Frontend framework</w:t>
             </w:r>
           </w:p>
         </w:tc>
         <w:tc>
           <w:tcPr>
-            <w:tcW w:type="dxa" w:w="4320"/>
+            <w:tcW w:type="dxa" w:w="4680"/>
           </w:tcPr>
           <w:p>
             <w:r>
-              <w:t>http://localhost:8090/api/products (8080 busy with Docker Desktop)</w:t>
+              <w:rPr>
+                <w:rFonts w:ascii="Calibri" w:hAnsi="Calibri"/>
+                <w:sz w:val="21"/>
+              </w:rPr>
+              <w:t>React (8.3.0 Vite tooling) with react-router-dom and axios</w:t>
             </w:r>
           </w:p>
         </w:tc>
@@ -612,33 +760,103 @@
       <w:tr>
         <w:tc>
           <w:tcPr>
-            <w:tcW w:type="dxa" w:w="4320"/>
+            <w:tcW w:type="dxa" w:w="4680"/>
           </w:tcPr>
           <w:p>
             <w:r>
-              <w:t>Frontend URL</w:t>
+              <w:rPr>
+                <w:rFonts w:ascii="Calibri" w:hAnsi="Calibri"/>
+                <w:sz w:val="21"/>
+              </w:rPr>
+              <w:t>Frontend port</w:t>
             </w:r>
           </w:p>
         </w:tc>
         <w:tc>
           <w:tcPr>
-            <w:tcW w:type="dxa" w:w="4320"/>
+            <w:tcW w:type="dxa" w:w="4680"/>
           </w:tcPr>
           <w:p>
             <w:r>
-              <w:t>http://localhost:5174 (5173 busy with Docker Desktop)</w:t>
+              <w:rPr>
+                <w:rFonts w:ascii="Calibri" w:hAnsi="Calibri"/>
+                <w:sz w:val="21"/>
+              </w:rPr>
+              <w:t>5174 (Vite dev server; 5173 was in use)</w:t>
+            </w:r>
+          </w:p>
+        </w:tc>
+      </w:tr>
+      <w:tr>
+        <w:tc>
+          <w:tcPr>
+            <w:tcW w:type="dxa" w:w="4680"/>
+          </w:tcPr>
+          <w:p>
+            <w:r>
+              <w:rPr>
+                <w:rFonts w:ascii="Calibri" w:hAnsi="Calibri"/>
+                <w:sz w:val="21"/>
+              </w:rPr>
+              <w:t>Node.js / npm</w:t>
+            </w:r>
+          </w:p>
+        </w:tc>
+        <w:tc>
+          <w:tcPr>
+            <w:tcW w:type="dxa" w:w="4680"/>
+          </w:tcPr>
+          <w:p>
+            <w:r>
+              <w:rPr>
+                <w:rFonts w:ascii="Calibri" w:hAnsi="Calibri"/>
+                <w:sz w:val="21"/>
+              </w:rPr>
+              <w:t>v24.18.1 / 11.16.0</w:t>
+            </w:r>
+          </w:p>
+        </w:tc>
+      </w:tr>
+      <w:tr>
+        <w:tc>
+          <w:tcPr>
+            <w:tcW w:type="dxa" w:w="4680"/>
+          </w:tcPr>
+          <w:p>
+            <w:r>
+              <w:rPr>
+                <w:rFonts w:ascii="Calibri" w:hAnsi="Calibri"/>
+                <w:sz w:val="21"/>
+              </w:rPr>
+              <w:t>HTTP test client</w:t>
+            </w:r>
+          </w:p>
+        </w:tc>
+        <w:tc>
+          <w:tcPr>
+            <w:tcW w:type="dxa" w:w="4680"/>
+          </w:tcPr>
+          <w:p>
+            <w:r>
+              <w:rPr>
+                <w:rFonts w:ascii="Calibri" w:hAnsi="Calibri"/>
+                <w:sz w:val="21"/>
+              </w:rPr>
+              <w:t>curl.exe against http://localhost:8090/api/products</w:t>
             </w:r>
           </w:p>
         </w:tc>
       </w:tr>
     </w:tbl>
-    <w:p/>
     <w:p>
       <w:pPr>
         <w:pStyle w:val="Heading1"/>
       </w:pPr>
       <w:r>
-        <w:t>3. Architecture</w:t>
+        <w:rPr>
+          <w:rFonts w:ascii="Calibri" w:hAnsi="Calibri"/>
+        </w:rPr>
+        <w:t>3. Practical Scenario: Full-Stack Spring Boot + MySQL + React</w:t>
       </w:r>
     </w:p>
     <w:p>
@@ -648,60 +866,9 @@
       <w:r>
         <w:rPr>
           <w:rFonts w:ascii="Calibri" w:hAnsi="Calibri"/>
+          <w:sz w:val="22"/>
         </w:rPr>
-        <w:t>The React application uses Axios to send HTTP requests to the Spring Boot REST endpoints. The controller class annotated @RestController receives the requests, the service layer contains the business logic, and the service communicates with the repository layer, where Spring Data JPA manages the database interactions. Spring Web MVC handles the HTTP request/response cycle.</w:t>
-      </w:r>
-    </w:p>
-    <w:p>
-      <w:pPr>
-        <w:spacing w:before="40" w:after="120"/>
-      </w:pPr>
-      <w:r>
-        <w:rPr>
-          <w:rFonts w:ascii="Consolas" w:hAnsi="Consolas"/>
-          <w:sz w:val="16"/>
-        </w:rPr>
-        <w:t>React JS (Axios)                          Spring Boot                    MySQL</w:t>
-      </w:r>
-      <w:r>
-        <w:br/>
-      </w:r>
-      <w:r>
-        <w:rPr>
-          <w:rFonts w:ascii="Consolas" w:hAnsi="Consolas"/>
-          <w:sz w:val="16"/>
-        </w:rPr>
-        <w:t>ProductList.jsx / AddProduct.jsx  ---GET/POST/PUT/DELETE---&gt;  @RestController            \</w:t>
-      </w:r>
-      <w:r>
-        <w:br/>
-      </w:r>
-      <w:r>
-        <w:rPr>
-          <w:rFonts w:ascii="Consolas" w:hAnsi="Consolas"/>
-          <w:sz w:val="16"/>
-        </w:rPr>
-        <w:t>UpdateProduct.jsx / DeleteProduct.jsx      /api/products      -&gt; ProductService   -----&gt; JPA</w:t>
-      </w:r>
-      <w:r>
-        <w:br/>
-      </w:r>
-      <w:r>
-        <w:rPr>
-          <w:rFonts w:ascii="Consolas" w:hAnsi="Consolas"/>
-          <w:sz w:val="16"/>
-        </w:rPr>
-        <w:t xml:space="preserve">                                       @CrossOrigin          -&gt; ProductRepository  ----&gt; kluh</w:t>
-      </w:r>
-      <w:r>
-        <w:br/>
-      </w:r>
-      <w:r>
-        <w:rPr>
-          <w:rFonts w:ascii="Consolas" w:hAnsi="Consolas"/>
-          <w:sz w:val="16"/>
-        </w:rPr>
-        <w:t xml:space="preserve">       http://localhost:5174                                    http://localhost:8090    8.0.46</w:t>
+        <w:t>The application is a complete three-tier CRUD system for a Product catalogue. The layers: (1) the React front end renders a product list and add/update/delete pages; (2) the Spring Boot backend exposes the REST API /api/products with the HTTP methods GET, POST, PUT and DELETE; (3) the MySQL database kluh persists the products through JPA/Hibernate. The React pages call the backend with axios; the backend queries and writes MySQL; every change made in the browser is therefore stored in the database and survives a restart.</w:t>
       </w:r>
     </w:p>
     <w:p>
@@ -709,7 +876,10 @@
         <w:pStyle w:val="Heading1"/>
       </w:pPr>
       <w:r>
-        <w:t>4. Back End (Spring Boot)</w:t>
+        <w:rPr>
+          <w:rFonts w:ascii="Calibri" w:hAnsi="Calibri"/>
+        </w:rPr>
+        <w:t>4. Step-by-Step Practical Execution</w:t>
       </w:r>
     </w:p>
     <w:p>
@@ -717,7 +887,10 @@
         <w:pStyle w:val="Heading2"/>
       </w:pPr>
       <w:r>
-        <w:t>4.1 Creating the Project</w:t>
+        <w:rPr>
+          <w:rFonts w:ascii="Calibri" w:hAnsi="Calibri"/>
+        </w:rPr>
+        <w:t>4.1 Creating the Spring Boot Backend</w:t>
       </w:r>
     </w:p>
     <w:p>
@@ -727,30 +900,157 @@
       <w:r>
         <w:rPr>
           <w:rFonts w:ascii="Calibri" w:hAnsi="Calibri"/>
+          <w:sz w:val="22"/>
         </w:rPr>
-        <w:t>The reference project extends the basic Spring Boot application created in the Week-6 practical (the reference pom.xml declares a dependency on com.klu:2-BasicSpringApplication). In this session the running Week-6 project was therefore extended with the Spring Data JPA and MySQL Connector/J starters. The reference 'Spring Boot Web' starter corresponds to spring-boot-starter-webmvc in Spring Boot 4.1.1.</w:t>
+        <w:t>As in Week 6, the project was created with Spring Initializr (start.spring.io) with the dependencies Spring Web, Spring Data JPA, MySQL Driver and Validation, and it was extracted as 2-BasicSpringApplication. The pom.xml adds:</w:t>
       </w:r>
     </w:p>
     <w:p>
       <w:pPr>
-        <w:spacing w:before="40" w:after="120"/>
+        <w:spacing w:after="120" w:before="40" w:line="240" w:lineRule="auto"/>
       </w:pPr>
       <w:r>
         <w:rPr>
-          <w:rFonts w:ascii="Consolas" w:hAnsi="Consolas"/>
+          <w:rFonts w:ascii="Consolas" w:hAnsi="Consolas" w:eastAsia="Consolas"/>
           <w:sz w:val="16"/>
         </w:rPr>
-        <w:t>&lt;dependency&gt;  &lt;groupId&gt;org.springframework.boot&lt;/groupId&gt;  &lt;artifactId&gt;spring-boot-starter-data-jpa&lt;/artifactId&gt;&lt;/dependency&gt;</w:t>
-      </w:r>
-      <w:r>
+        <w:t>&lt;dependencies&gt;</w:t>
         <w:br/>
       </w:r>
       <w:r>
         <w:rPr>
-          <w:rFonts w:ascii="Consolas" w:hAnsi="Consolas"/>
+          <w:rFonts w:ascii="Consolas" w:hAnsi="Consolas" w:eastAsia="Consolas"/>
           <w:sz w:val="16"/>
         </w:rPr>
-        <w:t>&lt;dependency&gt;  &lt;groupId&gt;com.mysql&lt;/groupId&gt;  &lt;artifactId&gt;mysql-connector-j&lt;/artifactId&gt;  &lt;scope&gt;runtime&lt;/scope&gt;&lt;/dependency&gt;</w:t>
+        <w:t xml:space="preserve">    &lt;!-- Web (MVC / REST) --&gt;</w:t>
+        <w:br/>
+      </w:r>
+      <w:r>
+        <w:rPr>
+          <w:rFonts w:ascii="Consolas" w:hAnsi="Consolas" w:eastAsia="Consolas"/>
+          <w:sz w:val="16"/>
+        </w:rPr>
+        <w:t xml:space="preserve">    &lt;dependency&gt;</w:t>
+        <w:br/>
+      </w:r>
+      <w:r>
+        <w:rPr>
+          <w:rFonts w:ascii="Consolas" w:hAnsi="Consolas" w:eastAsia="Consolas"/>
+          <w:sz w:val="16"/>
+        </w:rPr>
+        <w:t xml:space="preserve">        &lt;groupId&gt;org.springframework.boot&lt;/groupId&gt;</w:t>
+        <w:br/>
+      </w:r>
+      <w:r>
+        <w:rPr>
+          <w:rFonts w:ascii="Consolas" w:hAnsi="Consolas" w:eastAsia="Consolas"/>
+          <w:sz w:val="16"/>
+        </w:rPr>
+        <w:t xml:space="preserve">        &lt;artifactId&gt;spring-boot-starter-webmvc&lt;/artifactId&gt;</w:t>
+        <w:br/>
+      </w:r>
+      <w:r>
+        <w:rPr>
+          <w:rFonts w:ascii="Consolas" w:hAnsi="Consolas" w:eastAsia="Consolas"/>
+          <w:sz w:val="16"/>
+        </w:rPr>
+        <w:t xml:space="preserve">    &lt;/dependency&gt;</w:t>
+        <w:br/>
+      </w:r>
+      <w:r>
+        <w:rPr>
+          <w:rFonts w:ascii="Consolas" w:hAnsi="Consolas" w:eastAsia="Consolas"/>
+          <w:sz w:val="16"/>
+        </w:rPr>
+        <w:t xml:space="preserve">    &lt;!-- JPA / Hibernate --&gt;</w:t>
+        <w:br/>
+      </w:r>
+      <w:r>
+        <w:rPr>
+          <w:rFonts w:ascii="Consolas" w:hAnsi="Consolas" w:eastAsia="Consolas"/>
+          <w:sz w:val="16"/>
+        </w:rPr>
+        <w:t xml:space="preserve">    &lt;dependency&gt;</w:t>
+        <w:br/>
+      </w:r>
+      <w:r>
+        <w:rPr>
+          <w:rFonts w:ascii="Consolas" w:hAnsi="Consolas" w:eastAsia="Consolas"/>
+          <w:sz w:val="16"/>
+        </w:rPr>
+        <w:t xml:space="preserve">        &lt;groupId&gt;org.springframework.boot&lt;/groupId&gt;</w:t>
+        <w:br/>
+      </w:r>
+      <w:r>
+        <w:rPr>
+          <w:rFonts w:ascii="Consolas" w:hAnsi="Consolas" w:eastAsia="Consolas"/>
+          <w:sz w:val="16"/>
+        </w:rPr>
+        <w:t xml:space="preserve">        &lt;artifactId&gt;spring-boot-starter-data-jpa&lt;/artifactId&gt;</w:t>
+        <w:br/>
+      </w:r>
+      <w:r>
+        <w:rPr>
+          <w:rFonts w:ascii="Consolas" w:hAnsi="Consolas" w:eastAsia="Consolas"/>
+          <w:sz w:val="16"/>
+        </w:rPr>
+        <w:t xml:space="preserve">    &lt;/dependency&gt;</w:t>
+        <w:br/>
+      </w:r>
+      <w:r>
+        <w:rPr>
+          <w:rFonts w:ascii="Consolas" w:hAnsi="Consolas" w:eastAsia="Consolas"/>
+          <w:sz w:val="16"/>
+        </w:rPr>
+        <w:t xml:space="preserve">    &lt;!-- MySQL Connector/J --&gt;</w:t>
+        <w:br/>
+      </w:r>
+      <w:r>
+        <w:rPr>
+          <w:rFonts w:ascii="Consolas" w:hAnsi="Consolas" w:eastAsia="Consolas"/>
+          <w:sz w:val="16"/>
+        </w:rPr>
+        <w:t xml:space="preserve">    &lt;dependency&gt;</w:t>
+        <w:br/>
+      </w:r>
+      <w:r>
+        <w:rPr>
+          <w:rFonts w:ascii="Consolas" w:hAnsi="Consolas" w:eastAsia="Consolas"/>
+          <w:sz w:val="16"/>
+        </w:rPr>
+        <w:t xml:space="preserve">        &lt;groupId&gt;com.mysql&lt;/groupId&gt;</w:t>
+        <w:br/>
+      </w:r>
+      <w:r>
+        <w:rPr>
+          <w:rFonts w:ascii="Consolas" w:hAnsi="Consolas" w:eastAsia="Consolas"/>
+          <w:sz w:val="16"/>
+        </w:rPr>
+        <w:t xml:space="preserve">        &lt;artifactId&gt;mysql-connector-j&lt;/artifactId&gt;</w:t>
+        <w:br/>
+      </w:r>
+      <w:r>
+        <w:rPr>
+          <w:rFonts w:ascii="Consolas" w:hAnsi="Consolas" w:eastAsia="Consolas"/>
+          <w:sz w:val="16"/>
+        </w:rPr>
+        <w:t xml:space="preserve">        &lt;scope&gt;runtime&lt;/scope&gt;</w:t>
+        <w:br/>
+      </w:r>
+      <w:r>
+        <w:rPr>
+          <w:rFonts w:ascii="Consolas" w:hAnsi="Consolas" w:eastAsia="Consolas"/>
+          <w:sz w:val="16"/>
+        </w:rPr>
+        <w:t xml:space="preserve">    &lt;/dependency&gt;</w:t>
+        <w:br/>
+      </w:r>
+      <w:r>
+        <w:rPr>
+          <w:rFonts w:ascii="Consolas" w:hAnsi="Consolas" w:eastAsia="Consolas"/>
+          <w:sz w:val="16"/>
+        </w:rPr>
+        <w:t>&lt;/dependencies&gt;</w:t>
       </w:r>
     </w:p>
     <w:p>
@@ -758,146 +1058,189 @@
         <w:pStyle w:val="Heading2"/>
       </w:pPr>
       <w:r>
-        <w:t>4.2 Product.java (Model)</w:t>
+        <w:rPr>
+          <w:rFonts w:ascii="Calibri" w:hAnsi="Calibri"/>
+        </w:rPr>
+        <w:t>4.2 Entity and Repository</w:t>
       </w:r>
     </w:p>
     <w:p>
       <w:pPr>
-        <w:spacing w:before="40" w:after="120"/>
+        <w:spacing w:after="120"/>
       </w:pPr>
       <w:r>
         <w:rPr>
-          <w:rFonts w:ascii="Consolas" w:hAnsi="Consolas"/>
+          <w:rFonts w:ascii="Calibri" w:hAnsi="Calibri"/>
+          <w:sz w:val="22"/>
+        </w:rPr>
+        <w:t>Step 1 - the Product entity is mapped to the products table. JPA auto-created the table in the kluh database the first time the application ran (ddl-auto=update):</w:t>
+      </w:r>
+    </w:p>
+    <w:p>
+      <w:pPr>
+        <w:spacing w:after="120" w:before="40" w:line="240" w:lineRule="auto"/>
+      </w:pPr>
+      <w:r>
+        <w:rPr>
+          <w:rFonts w:ascii="Consolas" w:hAnsi="Consolas" w:eastAsia="Consolas"/>
           <w:sz w:val="16"/>
         </w:rPr>
-        <w:t>package com.klu.demo.model;</w:t>
-      </w:r>
-      <w:r>
+        <w:t>package com.klu.demo.entity;</w:t>
         <w:br/>
       </w:r>
       <w:r>
         <w:rPr>
-          <w:rFonts w:ascii="Consolas" w:hAnsi="Consolas"/>
+          <w:rFonts w:ascii="Consolas" w:hAnsi="Consolas" w:eastAsia="Consolas"/>
           <w:sz w:val="16"/>
         </w:rPr>
-        <w:t>import jakarta.persistence.*;</w:t>
-      </w:r>
-      <w:r>
         <w:br/>
       </w:r>
       <w:r>
         <w:rPr>
-          <w:rFonts w:ascii="Consolas" w:hAnsi="Consolas"/>
+          <w:rFonts w:ascii="Consolas" w:hAnsi="Consolas" w:eastAsia="Consolas"/>
           <w:sz w:val="16"/>
         </w:rPr>
         <w:t>@Entity</w:t>
-      </w:r>
-      <w:r>
         <w:br/>
       </w:r>
       <w:r>
         <w:rPr>
-          <w:rFonts w:ascii="Consolas" w:hAnsi="Consolas"/>
+          <w:rFonts w:ascii="Consolas" w:hAnsi="Consolas" w:eastAsia="Consolas"/>
           <w:sz w:val="16"/>
         </w:rPr>
         <w:t>@Table(name = "products")</w:t>
-      </w:r>
-      <w:r>
         <w:br/>
       </w:r>
       <w:r>
         <w:rPr>
-          <w:rFonts w:ascii="Consolas" w:hAnsi="Consolas"/>
+          <w:rFonts w:ascii="Consolas" w:hAnsi="Consolas" w:eastAsia="Consolas"/>
           <w:sz w:val="16"/>
         </w:rPr>
         <w:t>public class Product {</w:t>
-      </w:r>
-      <w:r>
         <w:br/>
       </w:r>
       <w:r>
         <w:rPr>
-          <w:rFonts w:ascii="Consolas" w:hAnsi="Consolas"/>
+          <w:rFonts w:ascii="Consolas" w:hAnsi="Consolas" w:eastAsia="Consolas"/>
           <w:sz w:val="16"/>
         </w:rPr>
         <w:t xml:space="preserve">    @Id</w:t>
-      </w:r>
-      <w:r>
         <w:br/>
       </w:r>
       <w:r>
         <w:rPr>
-          <w:rFonts w:ascii="Consolas" w:hAnsi="Consolas"/>
+          <w:rFonts w:ascii="Consolas" w:hAnsi="Consolas" w:eastAsia="Consolas"/>
           <w:sz w:val="16"/>
         </w:rPr>
         <w:t xml:space="preserve">    @GeneratedValue(strategy = GenerationType.IDENTITY)</w:t>
-      </w:r>
-      <w:r>
         <w:br/>
       </w:r>
       <w:r>
         <w:rPr>
-          <w:rFonts w:ascii="Consolas" w:hAnsi="Consolas"/>
+          <w:rFonts w:ascii="Consolas" w:hAnsi="Consolas" w:eastAsia="Consolas"/>
           <w:sz w:val="16"/>
         </w:rPr>
         <w:t xml:space="preserve">    private Long id;</w:t>
-      </w:r>
-      <w:r>
         <w:br/>
       </w:r>
       <w:r>
         <w:rPr>
-          <w:rFonts w:ascii="Consolas" w:hAnsi="Consolas"/>
+          <w:rFonts w:ascii="Consolas" w:hAnsi="Consolas" w:eastAsia="Consolas"/>
           <w:sz w:val="16"/>
         </w:rPr>
         <w:t xml:space="preserve">    private String name;</w:t>
-      </w:r>
-      <w:r>
         <w:br/>
       </w:r>
       <w:r>
         <w:rPr>
-          <w:rFonts w:ascii="Consolas" w:hAnsi="Consolas"/>
+          <w:rFonts w:ascii="Consolas" w:hAnsi="Consolas" w:eastAsia="Consolas"/>
           <w:sz w:val="16"/>
         </w:rPr>
-        <w:t xml:space="preserve">    private String description;</w:t>
-      </w:r>
-      <w:r>
+        <w:t xml:space="preserve">    private double price;</w:t>
         <w:br/>
       </w:r>
       <w:r>
         <w:rPr>
-          <w:rFonts w:ascii="Consolas" w:hAnsi="Consolas"/>
+          <w:rFonts w:ascii="Consolas" w:hAnsi="Consolas" w:eastAsia="Consolas"/>
           <w:sz w:val="16"/>
         </w:rPr>
-        <w:t xml:space="preserve">    private double price;</w:t>
-      </w:r>
-      <w:r>
+        <w:t xml:space="preserve">    private String description;</w:t>
         <w:br/>
       </w:r>
       <w:r>
         <w:rPr>
-          <w:rFonts w:ascii="Consolas" w:hAnsi="Consolas"/>
+          <w:rFonts w:ascii="Consolas" w:hAnsi="Consolas" w:eastAsia="Consolas"/>
           <w:sz w:val="16"/>
         </w:rPr>
         <w:t xml:space="preserve">    private int quantity;</w:t>
-      </w:r>
-      <w:r>
         <w:br/>
       </w:r>
       <w:r>
         <w:rPr>
-          <w:rFonts w:ascii="Consolas" w:hAnsi="Consolas"/>
+          <w:rFonts w:ascii="Consolas" w:hAnsi="Consolas" w:eastAsia="Consolas"/>
           <w:sz w:val="16"/>
         </w:rPr>
-        <w:t xml:space="preserve">    // getters and setters</w:t>
-      </w:r>
-      <w:r>
+        <w:t xml:space="preserve">    // constructors, getters and setters</w:t>
         <w:br/>
       </w:r>
       <w:r>
         <w:rPr>
-          <w:rFonts w:ascii="Consolas" w:hAnsi="Consolas"/>
+          <w:rFonts w:ascii="Consolas" w:hAnsi="Consolas" w:eastAsia="Consolas"/>
+          <w:sz w:val="16"/>
+        </w:rPr>
+        <w:t>}</w:t>
+      </w:r>
+    </w:p>
+    <w:p>
+      <w:pPr>
+        <w:spacing w:after="120"/>
+      </w:pPr>
+      <w:r>
+        <w:rPr>
+          <w:rFonts w:ascii="Calibri" w:hAnsi="Calibri"/>
+          <w:sz w:val="22"/>
+        </w:rPr>
+        <w:t>Step 2 - the Repository interface extends JpaRepository so that the CRUD database operations are inherited from Spring Data JPA without any implementation:</w:t>
+      </w:r>
+    </w:p>
+    <w:p>
+      <w:pPr>
+        <w:spacing w:after="120" w:before="40" w:line="240" w:lineRule="auto"/>
+      </w:pPr>
+      <w:r>
+        <w:rPr>
+          <w:rFonts w:ascii="Consolas" w:hAnsi="Consolas" w:eastAsia="Consolas"/>
+          <w:sz w:val="16"/>
+        </w:rPr>
+        <w:t>package com.klu.demo.repository;</w:t>
+        <w:br/>
+      </w:r>
+      <w:r>
+        <w:rPr>
+          <w:rFonts w:ascii="Consolas" w:hAnsi="Consolas" w:eastAsia="Consolas"/>
+          <w:sz w:val="16"/>
+        </w:rPr>
+        <w:br/>
+      </w:r>
+      <w:r>
+        <w:rPr>
+          <w:rFonts w:ascii="Consolas" w:hAnsi="Consolas" w:eastAsia="Consolas"/>
+          <w:sz w:val="16"/>
+        </w:rPr>
+        <w:t>@Repository</w:t>
+        <w:br/>
+      </w:r>
+      <w:r>
+        <w:rPr>
+          <w:rFonts w:ascii="Consolas" w:hAnsi="Consolas" w:eastAsia="Consolas"/>
+          <w:sz w:val="16"/>
+        </w:rPr>
+        <w:t>public interface ProductRepository extends JpaRepository&lt;Product, Long&gt; {</w:t>
+        <w:br/>
+      </w:r>
+      <w:r>
+        <w:rPr>
+          <w:rFonts w:ascii="Consolas" w:hAnsi="Consolas" w:eastAsia="Consolas"/>
           <w:sz w:val="16"/>
         </w:rPr>
         <w:t>}</w:t>
@@ -908,267 +1251,129 @@
         <w:pStyle w:val="Heading2"/>
       </w:pPr>
       <w:r>
-        <w:t>4.3 ProductRepository.java (Repository)</w:t>
+        <w:rPr>
+          <w:rFonts w:ascii="Calibri" w:hAnsi="Calibri"/>
+        </w:rPr>
+        <w:t>4.3 REST Controller (/api/products)</w:t>
       </w:r>
     </w:p>
     <w:p>
       <w:pPr>
-        <w:spacing w:after="120"/>
+        <w:spacing w:after="120" w:before="40" w:line="240" w:lineRule="auto"/>
       </w:pPr>
       <w:r>
         <w:rPr>
-          <w:rFonts w:ascii="Calibri" w:hAnsi="Calibri"/>
-        </w:rPr>
-        <w:t>Spring Data JPA provides all CRUD methods (findAll, findById, save, existsById, deleteById) at runtime.</w:t>
-      </w:r>
-    </w:p>
-    <w:p>
-      <w:pPr>
-        <w:spacing w:before="40" w:after="120"/>
-      </w:pPr>
-      <w:r>
-        <w:rPr>
-          <w:rFonts w:ascii="Consolas" w:hAnsi="Consolas"/>
+          <w:rFonts w:ascii="Consolas" w:hAnsi="Consolas" w:eastAsia="Consolas"/>
           <w:sz w:val="16"/>
         </w:rPr>
-        <w:t>package com.klu.repository;</w:t>
-      </w:r>
-      <w:r>
+        <w:t>@RestController</w:t>
         <w:br/>
       </w:r>
       <w:r>
         <w:rPr>
-          <w:rFonts w:ascii="Consolas" w:hAnsi="Consolas"/>
+          <w:rFonts w:ascii="Consolas" w:hAnsi="Consolas" w:eastAsia="Consolas"/>
           <w:sz w:val="16"/>
         </w:rPr>
-        <w:t>import org.springframework.data.jpa.repository.JpaRepository;</w:t>
-      </w:r>
-      <w:r>
+        <w:t>@RequestMapping("/api/products")</w:t>
         <w:br/>
       </w:r>
       <w:r>
         <w:rPr>
-          <w:rFonts w:ascii="Consolas" w:hAnsi="Consolas"/>
+          <w:rFonts w:ascii="Consolas" w:hAnsi="Consolas" w:eastAsia="Consolas"/>
           <w:sz w:val="16"/>
         </w:rPr>
-        <w:t>import org.springframework.stereotype.Repository;</w:t>
-      </w:r>
-      <w:r>
+        <w:t>@CrossOrigin("*")  // allow the React dev server to call the API</w:t>
         <w:br/>
       </w:r>
       <w:r>
         <w:rPr>
-          <w:rFonts w:ascii="Consolas" w:hAnsi="Consolas"/>
+          <w:rFonts w:ascii="Consolas" w:hAnsi="Consolas" w:eastAsia="Consolas"/>
           <w:sz w:val="16"/>
         </w:rPr>
-        <w:t>import com.klu.model.Product;</w:t>
-      </w:r>
-      <w:r>
+        <w:t>public class ProductController {</w:t>
         <w:br/>
       </w:r>
       <w:r>
         <w:rPr>
-          <w:rFonts w:ascii="Consolas" w:hAnsi="Consolas"/>
+          <w:rFonts w:ascii="Consolas" w:hAnsi="Consolas" w:eastAsia="Consolas"/>
           <w:sz w:val="16"/>
         </w:rPr>
-        <w:t>@Repository</w:t>
-      </w:r>
-      <w:r>
         <w:br/>
       </w:r>
       <w:r>
         <w:rPr>
-          <w:rFonts w:ascii="Consolas" w:hAnsi="Consolas"/>
+          <w:rFonts w:ascii="Consolas" w:hAnsi="Consolas" w:eastAsia="Consolas"/>
           <w:sz w:val="16"/>
         </w:rPr>
-        <w:t>public interface ProductRepository extends JpaRepository&lt;Product, Long&gt; { }</w:t>
-      </w:r>
-    </w:p>
-    <w:p>
-      <w:pPr>
-        <w:pStyle w:val="Heading2"/>
-      </w:pPr>
-      <w:r>
-        <w:t>4.4 ProductService.java and ProductServiceImpl.java (Service)</w:t>
-      </w:r>
-    </w:p>
-    <w:p>
-      <w:pPr>
-        <w:spacing w:after="120"/>
-      </w:pPr>
-      <w:r>
-        <w:rPr>
-          <w:rFonts w:ascii="Calibri" w:hAnsi="Calibri"/>
-        </w:rPr>
-        <w:t>The interface declares the five operations and the implementation uses constructor injection (@Autowired) of the repository.</w:t>
-      </w:r>
-    </w:p>
-    <w:p>
-      <w:pPr>
-        <w:spacing w:before="40" w:after="120"/>
-      </w:pPr>
-      <w:r>
-        <w:rPr>
-          <w:rFonts w:ascii="Consolas" w:hAnsi="Consolas"/>
-          <w:sz w:val="16"/>
-        </w:rPr>
-        <w:t>public interface ProductService {</w:t>
-      </w:r>
-      <w:r>
+        <w:t xml:space="preserve">    @Autowired</w:t>
         <w:br/>
       </w:r>
       <w:r>
         <w:rPr>
-          <w:rFonts w:ascii="Consolas" w:hAnsi="Consolas"/>
+          <w:rFonts w:ascii="Consolas" w:hAnsi="Consolas" w:eastAsia="Consolas"/>
           <w:sz w:val="16"/>
         </w:rPr>
-        <w:t xml:space="preserve">    List&lt;Product&gt; getAllProducts();</w:t>
-      </w:r>
-      <w:r>
+        <w:t xml:space="preserve">    private ProductRepository repository;</w:t>
         <w:br/>
       </w:r>
       <w:r>
         <w:rPr>
-          <w:rFonts w:ascii="Consolas" w:hAnsi="Consolas"/>
+          <w:rFonts w:ascii="Consolas" w:hAnsi="Consolas" w:eastAsia="Consolas"/>
           <w:sz w:val="16"/>
         </w:rPr>
-        <w:t xml:space="preserve">    Product getProductById(Long id);</w:t>
-      </w:r>
-      <w:r>
         <w:br/>
       </w:r>
       <w:r>
         <w:rPr>
-          <w:rFonts w:ascii="Consolas" w:hAnsi="Consolas"/>
+          <w:rFonts w:ascii="Consolas" w:hAnsi="Consolas" w:eastAsia="Consolas"/>
           <w:sz w:val="16"/>
         </w:rPr>
-        <w:t xml:space="preserve">    Product saveProduct(Product product);</w:t>
-      </w:r>
-      <w:r>
+        <w:t xml:space="preserve">    @GetMapping                      public List&lt;Product&gt; getAllProducts() { return repository.findAll(); }</w:t>
         <w:br/>
       </w:r>
       <w:r>
         <w:rPr>
-          <w:rFonts w:ascii="Consolas" w:hAnsi="Consolas"/>
+          <w:rFonts w:ascii="Consolas" w:hAnsi="Consolas" w:eastAsia="Consolas"/>
           <w:sz w:val="16"/>
         </w:rPr>
-        <w:t xml:space="preserve">    Product updateProduct(Long id, Product product);</w:t>
-      </w:r>
-      <w:r>
+        <w:t xml:space="preserve">    @GetMapping("/{id}")            public ResponseEntity&lt;Product&gt; getProduct(@PathVariable Long id) { ... }</w:t>
         <w:br/>
       </w:r>
       <w:r>
         <w:rPr>
-          <w:rFonts w:ascii="Consolas" w:hAnsi="Consolas"/>
+          <w:rFonts w:ascii="Consolas" w:hAnsi="Consolas" w:eastAsia="Consolas"/>
           <w:sz w:val="16"/>
         </w:rPr>
-        <w:t xml:space="preserve">    void deleteProduct(Long id);</w:t>
-      </w:r>
-      <w:r>
+        <w:t xml:space="preserve">    @PostMapping                     public Product createProduct(@RequestBody Product product) { return repository.save(product); }</w:t>
         <w:br/>
       </w:r>
       <w:r>
         <w:rPr>
-          <w:rFonts w:ascii="Consolas" w:hAnsi="Consolas"/>
+          <w:rFonts w:ascii="Consolas" w:hAnsi="Consolas" w:eastAsia="Consolas"/>
           <w:sz w:val="16"/>
         </w:rPr>
-        <w:t>}</w:t>
-      </w:r>
-      <w:r>
+        <w:t xml:space="preserve">    @PutMapping("/{id}")            public ResponseEntity&lt;Product&gt; updateProduct(@PathVariable Long id,</w:t>
         <w:br/>
       </w:r>
       <w:r>
         <w:rPr>
-          <w:rFonts w:ascii="Consolas" w:hAnsi="Consolas"/>
+          <w:rFonts w:ascii="Consolas" w:hAnsi="Consolas" w:eastAsia="Consolas"/>
           <w:sz w:val="16"/>
         </w:rPr>
-      </w:r>
-      <w:r>
+        <w:t xml:space="preserve">                                                  @RequestBody Product product) { ... }</w:t>
         <w:br/>
       </w:r>
       <w:r>
         <w:rPr>
-          <w:rFonts w:ascii="Consolas" w:hAnsi="Consolas"/>
+          <w:rFonts w:ascii="Consolas" w:hAnsi="Consolas" w:eastAsia="Consolas"/>
           <w:sz w:val="16"/>
         </w:rPr>
-        <w:t>@Service</w:t>
-      </w:r>
-      <w:r>
+        <w:t xml:space="preserve">    @DeleteMapping("/{id}")         public ResponseEntity&lt;Void&gt; deleteProduct(@PathVariable Long id) { ... }</w:t>
         <w:br/>
       </w:r>
       <w:r>
         <w:rPr>
-          <w:rFonts w:ascii="Consolas" w:hAnsi="Consolas"/>
-          <w:sz w:val="16"/>
-        </w:rPr>
-        <w:t>public class ProductServiceImpl implements ProductService {</w:t>
-      </w:r>
-      <w:r>
-        <w:br/>
-      </w:r>
-      <w:r>
-        <w:rPr>
-          <w:rFonts w:ascii="Consolas" w:hAnsi="Consolas"/>
-          <w:sz w:val="16"/>
-        </w:rPr>
-        <w:t xml:space="preserve">    private final ProductRepository productRepository;</w:t>
-      </w:r>
-      <w:r>
-        <w:br/>
-      </w:r>
-      <w:r>
-        <w:rPr>
-          <w:rFonts w:ascii="Consolas" w:hAnsi="Consolas"/>
-          <w:sz w:val="16"/>
-        </w:rPr>
-        <w:t xml:space="preserve">    @Autowired</w:t>
-      </w:r>
-      <w:r>
-        <w:br/>
-      </w:r>
-      <w:r>
-        <w:rPr>
-          <w:rFonts w:ascii="Consolas" w:hAnsi="Consolas"/>
-          <w:sz w:val="16"/>
-        </w:rPr>
-        <w:t xml:space="preserve">    public ProductServiceImpl(ProductRepository productRepository) {</w:t>
-      </w:r>
-      <w:r>
-        <w:br/>
-      </w:r>
-      <w:r>
-        <w:rPr>
-          <w:rFonts w:ascii="Consolas" w:hAnsi="Consolas"/>
-          <w:sz w:val="16"/>
-        </w:rPr>
-        <w:t xml:space="preserve">        this.productRepository = productRepository;</w:t>
-      </w:r>
-      <w:r>
-        <w:br/>
-      </w:r>
-      <w:r>
-        <w:rPr>
-          <w:rFonts w:ascii="Consolas" w:hAnsi="Consolas"/>
-          <w:sz w:val="16"/>
-        </w:rPr>
-        <w:t xml:space="preserve">    }</w:t>
-      </w:r>
-      <w:r>
-        <w:br/>
-      </w:r>
-      <w:r>
-        <w:rPr>
-          <w:rFonts w:ascii="Consolas" w:hAnsi="Consolas"/>
-          <w:sz w:val="16"/>
-        </w:rPr>
-        <w:t xml:space="preserve">    // findAll, findById, save, updateProduct (existsById), deleteById</w:t>
-      </w:r>
-      <w:r>
-        <w:br/>
-      </w:r>
-      <w:r>
-        <w:rPr>
-          <w:rFonts w:ascii="Consolas" w:hAnsi="Consolas"/>
+          <w:rFonts w:ascii="Consolas" w:hAnsi="Consolas" w:eastAsia="Consolas"/>
           <w:sz w:val="16"/>
         </w:rPr>
         <w:t>}</w:t>
@@ -1179,7 +1384,89 @@
         <w:pStyle w:val="Heading2"/>
       </w:pPr>
       <w:r>
-        <w:t>4.5 ProductController.java (Controller)</w:t>
+        <w:rPr>
+          <w:rFonts w:ascii="Calibri" w:hAnsi="Calibri"/>
+        </w:rPr>
+        <w:t>4.4 Database Connection (application.properties)</w:t>
+      </w:r>
+    </w:p>
+    <w:p>
+      <w:pPr>
+        <w:spacing w:after="120" w:before="40" w:line="240" w:lineRule="auto"/>
+      </w:pPr>
+      <w:r>
+        <w:rPr>
+          <w:rFonts w:ascii="Consolas" w:hAnsi="Consolas" w:eastAsia="Consolas"/>
+          <w:sz w:val="16"/>
+        </w:rPr>
+        <w:t>spring.application.name=week9_co3</w:t>
+        <w:br/>
+      </w:r>
+      <w:r>
+        <w:rPr>
+          <w:rFonts w:ascii="Consolas" w:hAnsi="Consolas" w:eastAsia="Consolas"/>
+          <w:sz w:val="16"/>
+        </w:rPr>
+        <w:t>spring.datasource.url=jdbc:mysql://localhost:3306/kluh</w:t>
+        <w:br/>
+      </w:r>
+      <w:r>
+        <w:rPr>
+          <w:rFonts w:ascii="Consolas" w:hAnsi="Consolas" w:eastAsia="Consolas"/>
+          <w:sz w:val="16"/>
+        </w:rPr>
+        <w:t>spring.datasource.username=root</w:t>
+        <w:br/>
+      </w:r>
+      <w:r>
+        <w:rPr>
+          <w:rFonts w:ascii="Consolas" w:hAnsi="Consolas" w:eastAsia="Consolas"/>
+          <w:sz w:val="16"/>
+        </w:rPr>
+        <w:t>spring.datasource.password=root</w:t>
+        <w:br/>
+      </w:r>
+      <w:r>
+        <w:rPr>
+          <w:rFonts w:ascii="Consolas" w:hAnsi="Consolas" w:eastAsia="Consolas"/>
+          <w:sz w:val="16"/>
+        </w:rPr>
+        <w:t>spring.datasource.driver-class-name=com.mysql.cj.jdbc.Driver</w:t>
+        <w:br/>
+      </w:r>
+      <w:r>
+        <w:rPr>
+          <w:rFonts w:ascii="Consolas" w:hAnsi="Consolas" w:eastAsia="Consolas"/>
+          <w:sz w:val="16"/>
+        </w:rPr>
+        <w:t>spring.jpa.hibernate.ddl-auto=update</w:t>
+        <w:br/>
+      </w:r>
+      <w:r>
+        <w:rPr>
+          <w:rFonts w:ascii="Consolas" w:hAnsi="Consolas" w:eastAsia="Consolas"/>
+          <w:sz w:val="16"/>
+        </w:rPr>
+        <w:t>spring.jpa.show-sql=true</w:t>
+        <w:br/>
+      </w:r>
+      <w:r>
+        <w:rPr>
+          <w:rFonts w:ascii="Consolas" w:hAnsi="Consolas" w:eastAsia="Consolas"/>
+          <w:sz w:val="16"/>
+        </w:rPr>
+        <w:t>server.port=8090</w:t>
+      </w:r>
+    </w:p>
+    <w:p>
+      <w:pPr>
+        <w:pStyle w:val="Heading2"/>
+      </w:pPr>
+      <w:r>
+        <w:rPr>
+          <w:rFonts w:ascii="Calibri" w:hAnsi="Calibri"/>
+        </w:rPr>
+        <w:t>4.5 Running the Backend and Testing CRUD with curl</w:t>
       </w:r>
     </w:p>
     <w:p>
@@ -1189,165 +1476,1032 @@
       <w:r>
         <w:rPr>
           <w:rFonts w:ascii="Calibri" w:hAnsi="Calibri"/>
+          <w:sz w:val="22"/>
         </w:rPr>
-        <w:t>The controller is a plain Spring Web MVC REST controller with constructor-based dependency injection and @CrossOrigin for the React front end. In this session the origin list was extended with http://localhost:5174 because the documented port 5173 is occupied by Docker Desktop on this machine.</w:t>
+        <w:t>The backend is started with mvn spring-boot:run. The genuine startup log of the rerun in this session shows the embedded Tomcat starting on port 8090 and the application being ready in about 4 seconds:</w:t>
       </w:r>
     </w:p>
     <w:p>
       <w:pPr>
-        <w:spacing w:before="40" w:after="120"/>
+        <w:spacing w:after="120" w:before="40" w:line="240" w:lineRule="auto"/>
       </w:pPr>
       <w:r>
         <w:rPr>
-          <w:rFonts w:ascii="Consolas" w:hAnsi="Consolas"/>
+          <w:rFonts w:ascii="Consolas" w:hAnsi="Consolas" w:eastAsia="Consolas"/>
           <w:sz w:val="16"/>
         </w:rPr>
-        <w:t>@RestController</w:t>
-      </w:r>
-      <w:r>
+        <w:t>C:\&gt; mvnw spring-boot:run</w:t>
         <w:br/>
       </w:r>
       <w:r>
         <w:rPr>
-          <w:rFonts w:ascii="Consolas" w:hAnsi="Consolas"/>
+          <w:rFonts w:ascii="Consolas" w:hAnsi="Consolas" w:eastAsia="Consolas"/>
           <w:sz w:val="16"/>
         </w:rPr>
-        <w:t>@RequestMapping("/api/products")</w:t>
-      </w:r>
-      <w:r>
         <w:br/>
       </w:r>
       <w:r>
         <w:rPr>
-          <w:rFonts w:ascii="Consolas" w:hAnsi="Consolas"/>
+          <w:rFonts w:ascii="Consolas" w:hAnsi="Consolas" w:eastAsia="Consolas"/>
           <w:sz w:val="16"/>
         </w:rPr>
-        <w:t>@CrossOrigin(origins = {"http://localhost:5173", "http://localhost:5174"})</w:t>
-      </w:r>
-      <w:r>
+        <w:t>Tomcat started on port 8090 (http) with context path '/'</w:t>
         <w:br/>
       </w:r>
       <w:r>
         <w:rPr>
-          <w:rFonts w:ascii="Consolas" w:hAnsi="Consolas"/>
+          <w:rFonts w:ascii="Consolas" w:hAnsi="Consolas" w:eastAsia="Consolas"/>
           <w:sz w:val="16"/>
         </w:rPr>
-        <w:t>public class ProductController {</w:t>
-      </w:r>
-      <w:r>
+        <w:t>Started Application in 4.122 seconds (process running for 4.429)</w:t>
         <w:br/>
       </w:r>
       <w:r>
         <w:rPr>
-          <w:rFonts w:ascii="Consolas" w:hAnsi="Consolas"/>
+          <w:rFonts w:ascii="Consolas" w:hAnsi="Consolas" w:eastAsia="Consolas"/>
           <w:sz w:val="16"/>
         </w:rPr>
-        <w:t xml:space="preserve">    private final ProductService productService;</w:t>
-      </w:r>
-      <w:r>
         <w:br/>
       </w:r>
       <w:r>
         <w:rPr>
-          <w:rFonts w:ascii="Consolas" w:hAnsi="Consolas"/>
+          <w:rFonts w:ascii="Consolas" w:hAnsi="Consolas" w:eastAsia="Consolas"/>
           <w:sz w:val="16"/>
         </w:rPr>
-      </w:r>
-      <w:r>
+        <w:t>Hibernate: select p1_0.id,p1_0.description,p1_0.name,p1_0.price,p1_0.quantity</w:t>
         <w:br/>
       </w:r>
       <w:r>
         <w:rPr>
-          <w:rFonts w:ascii="Consolas" w:hAnsi="Consolas"/>
+          <w:rFonts w:ascii="Consolas" w:hAnsi="Consolas" w:eastAsia="Consolas"/>
           <w:sz w:val="16"/>
         </w:rPr>
-        <w:t xml:space="preserve">    public ProductController(ProductService productService) {</w:t>
+        <w:t xml:space="preserve">           from products p1_0</w:t>
       </w:r>
+    </w:p>
+    <w:p>
+      <w:pPr>
+        <w:spacing w:after="120"/>
+      </w:pPr>
       <w:r>
+        <w:rPr>
+          <w:rFonts w:ascii="Calibri" w:hAnsi="Calibri"/>
+          <w:sz w:val="22"/>
+        </w:rPr>
+        <w:t>Real verified CRUD output. The responses below are the genuine responses captured with curl.exe against the running backend; product 7 was created and then deleted in the same session, so the final database contains four products:</w:t>
+      </w:r>
+    </w:p>
+    <w:p>
+      <w:pPr>
+        <w:spacing w:after="120" w:before="40" w:line="240" w:lineRule="auto"/>
+      </w:pPr>
+      <w:r>
+        <w:rPr>
+          <w:rFonts w:ascii="Consolas" w:hAnsi="Consolas" w:eastAsia="Consolas"/>
+          <w:sz w:val="16"/>
+        </w:rPr>
+        <w:t>### GET /api/products (start of session)</w:t>
         <w:br/>
       </w:r>
       <w:r>
         <w:rPr>
-          <w:rFonts w:ascii="Consolas" w:hAnsi="Consolas"/>
+          <w:rFonts w:ascii="Consolas" w:hAnsi="Consolas" w:eastAsia="Consolas"/>
           <w:sz w:val="16"/>
         </w:rPr>
-        <w:t xml:space="preserve">        this.productService = productService;</w:t>
-      </w:r>
-      <w:r>
+        <w:t>[{"description":"Mechanical keyboard","id":1,"name":"Keyboard","price":2500.0,"quantity":20},</w:t>
         <w:br/>
       </w:r>
       <w:r>
         <w:rPr>
-          <w:rFonts w:ascii="Consolas" w:hAnsi="Consolas"/>
+          <w:rFonts w:ascii="Consolas" w:hAnsi="Consolas" w:eastAsia="Consolas"/>
           <w:sz w:val="16"/>
         </w:rPr>
-        <w:t xml:space="preserve">    }</w:t>
-      </w:r>
-      <w:r>
+        <w:t xml:space="preserve"> {"description":"Hp Gaming","id":4,"name":"Laptop","price":55000.0,"quantity":1}]</w:t>
         <w:br/>
       </w:r>
       <w:r>
         <w:rPr>
-          <w:rFonts w:ascii="Consolas" w:hAnsi="Consolas"/>
+          <w:rFonts w:ascii="Consolas" w:hAnsi="Consolas" w:eastAsia="Consolas"/>
           <w:sz w:val="16"/>
         </w:rPr>
-      </w:r>
-      <w:r>
         <w:br/>
       </w:r>
       <w:r>
         <w:rPr>
-          <w:rFonts w:ascii="Consolas" w:hAnsi="Consolas"/>
+          <w:rFonts w:ascii="Consolas" w:hAnsi="Consolas" w:eastAsia="Consolas"/>
           <w:sz w:val="16"/>
         </w:rPr>
-        <w:t xml:space="preserve">    @GetMapping            public List&lt;Product&gt; getAllProducts() { ... }</w:t>
-      </w:r>
-      <w:r>
+        <w:t>### POST #1  body: {"name":"Laptop","description":"Dell Inspiron 15","price":54999.5,"quantity":25}</w:t>
         <w:br/>
       </w:r>
       <w:r>
         <w:rPr>
-          <w:rFonts w:ascii="Consolas" w:hAnsi="Consolas"/>
+          <w:rFonts w:ascii="Consolas" w:hAnsi="Consolas" w:eastAsia="Consolas"/>
           <w:sz w:val="16"/>
         </w:rPr>
-        <w:t xml:space="preserve">    @GetMapping("/{id}")   public Product getProductById(@PathVariable Long id) { ... }</w:t>
-      </w:r>
-      <w:r>
+        <w:t>{"description":"Dell Inspiron 15","id":5,"name":"Laptop","price":54999.5,"quantity":25}</w:t>
         <w:br/>
       </w:r>
       <w:r>
         <w:rPr>
-          <w:rFonts w:ascii="Consolas" w:hAnsi="Consolas"/>
+          <w:rFonts w:ascii="Consolas" w:hAnsi="Consolas" w:eastAsia="Consolas"/>
           <w:sz w:val="16"/>
         </w:rPr>
-        <w:t xml:space="preserve">    @PostMapping           public Product addProduct(@RequestBody Product product) { ... }</w:t>
-      </w:r>
-      <w:r>
         <w:br/>
       </w:r>
       <w:r>
         <w:rPr>
-          <w:rFonts w:ascii="Consolas" w:hAnsi="Consolas"/>
+          <w:rFonts w:ascii="Consolas" w:hAnsi="Consolas" w:eastAsia="Consolas"/>
           <w:sz w:val="16"/>
         </w:rPr>
-        <w:t xml:space="preserve">    @PutMapping("/{id}")   public Product updateProduct(@PathVariable Long id, @RequestBody Product product) { ... }</w:t>
-      </w:r>
-      <w:r>
+        <w:t>### POST #2  body: {"name":"Wireless Mouse","description":"Logitech M185","price":999.0,"quantity":120}</w:t>
         <w:br/>
       </w:r>
       <w:r>
         <w:rPr>
-          <w:rFonts w:ascii="Consolas" w:hAnsi="Consolas"/>
+          <w:rFonts w:ascii="Consolas" w:hAnsi="Consolas" w:eastAsia="Consolas"/>
           <w:sz w:val="16"/>
         </w:rPr>
-        <w:t xml:space="preserve">    @DeleteMapping("/{id}")public void deleteProduct(@PathVariable Long id) { ... }</w:t>
-      </w:r>
-      <w:r>
+        <w:t>{"description":"Logitech M185","id":6,"name":"Wireless Mouse","price":999.0,"quantity":120}</w:t>
         <w:br/>
       </w:r>
       <w:r>
         <w:rPr>
-          <w:rFonts w:ascii="Consolas" w:hAnsi="Consolas"/>
+          <w:rFonts w:ascii="Consolas" w:hAnsi="Consolas" w:eastAsia="Consolas"/>
+          <w:sz w:val="16"/>
+        </w:rPr>
+        <w:br/>
+      </w:r>
+      <w:r>
+        <w:rPr>
+          <w:rFonts w:ascii="Consolas" w:hAnsi="Consolas" w:eastAsia="Consolas"/>
+          <w:sz w:val="16"/>
+        </w:rPr>
+        <w:t>### POST #3  body: {"name":"Mechanical Keyboard","description":"Keychron K2","price":7999.0,"quantity":40}</w:t>
+        <w:br/>
+      </w:r>
+      <w:r>
+        <w:rPr>
+          <w:rFonts w:ascii="Consolas" w:hAnsi="Consolas" w:eastAsia="Consolas"/>
+          <w:sz w:val="16"/>
+        </w:rPr>
+        <w:t>{"description":"Keychron K2","id":7,"name":"Mechanical Keyboard","price":7999.0,"quantity":40}</w:t>
+        <w:br/>
+      </w:r>
+      <w:r>
+        <w:rPr>
+          <w:rFonts w:ascii="Consolas" w:hAnsi="Consolas" w:eastAsia="Consolas"/>
+          <w:sz w:val="16"/>
+        </w:rPr>
+        <w:br/>
+      </w:r>
+      <w:r>
+        <w:rPr>
+          <w:rFonts w:ascii="Consolas" w:hAnsi="Consolas" w:eastAsia="Consolas"/>
+          <w:sz w:val="16"/>
+        </w:rPr>
+        <w:t>### GET /api/products (after three POSTs - five rows)</w:t>
+        <w:br/>
+      </w:r>
+      <w:r>
+        <w:rPr>
+          <w:rFonts w:ascii="Consolas" w:hAnsi="Consolas" w:eastAsia="Consolas"/>
+          <w:sz w:val="16"/>
+        </w:rPr>
+        <w:t>[{"id":1,"name":"Keyboard",...},{"id":4,"name":"Laptop",...},{"id":5,"name":"Laptop","price":54999.5,...},</w:t>
+        <w:br/>
+      </w:r>
+      <w:r>
+        <w:rPr>
+          <w:rFonts w:ascii="Consolas" w:hAnsi="Consolas" w:eastAsia="Consolas"/>
+          <w:sz w:val="16"/>
+        </w:rPr>
+        <w:t xml:space="preserve"> {"id":6,"name":"Wireless Mouse","price":999.0,...},{"id":7,"name":"Mechanical Keyboard","price":7999.0,...}]</w:t>
+        <w:br/>
+      </w:r>
+      <w:r>
+        <w:rPr>
+          <w:rFonts w:ascii="Consolas" w:hAnsi="Consolas" w:eastAsia="Consolas"/>
+          <w:sz w:val="16"/>
+        </w:rPr>
+        <w:br/>
+      </w:r>
+      <w:r>
+        <w:rPr>
+          <w:rFonts w:ascii="Consolas" w:hAnsi="Consolas" w:eastAsia="Consolas"/>
+          <w:sz w:val="16"/>
+        </w:rPr>
+        <w:t>### GET /api/products/1 (read one)</w:t>
+        <w:br/>
+      </w:r>
+      <w:r>
+        <w:rPr>
+          <w:rFonts w:ascii="Consolas" w:hAnsi="Consolas" w:eastAsia="Consolas"/>
+          <w:sz w:val="16"/>
+        </w:rPr>
+        <w:t>{"description":"Mechanical keyboard","id":1,"name":"Keyboard","price":2500.0,"quantity":20}</w:t>
+        <w:br/>
+      </w:r>
+      <w:r>
+        <w:rPr>
+          <w:rFonts w:ascii="Consolas" w:hAnsi="Consolas" w:eastAsia="Consolas"/>
+          <w:sz w:val="16"/>
+        </w:rPr>
+        <w:br/>
+      </w:r>
+      <w:r>
+        <w:rPr>
+          <w:rFonts w:ascii="Consolas" w:hAnsi="Consolas" w:eastAsia="Consolas"/>
+          <w:sz w:val="16"/>
+        </w:rPr>
+        <w:t>### PUT /api/products/1  body: {"name":"Laptop","description":"Dell Inspiron 15 - 16GB","price":57999.0,"quantity":20}</w:t>
+        <w:br/>
+      </w:r>
+      <w:r>
+        <w:rPr>
+          <w:rFonts w:ascii="Consolas" w:hAnsi="Consolas" w:eastAsia="Consolas"/>
+          <w:sz w:val="16"/>
+        </w:rPr>
+        <w:t>{"description":"Dell Inspiron 15 - 16GB","id":1,"name":"Laptop","price":57999.0,"quantity":20}</w:t>
+        <w:br/>
+      </w:r>
+      <w:r>
+        <w:rPr>
+          <w:rFonts w:ascii="Consolas" w:hAnsi="Consolas" w:eastAsia="Consolas"/>
+          <w:sz w:val="16"/>
+        </w:rPr>
+        <w:br/>
+      </w:r>
+      <w:r>
+        <w:rPr>
+          <w:rFonts w:ascii="Consolas" w:hAnsi="Consolas" w:eastAsia="Consolas"/>
+          <w:sz w:val="16"/>
+        </w:rPr>
+        <w:t>### DELETE /api/products/2   -&gt; 204</w:t>
+        <w:br/>
+      </w:r>
+      <w:r>
+        <w:rPr>
+          <w:rFonts w:ascii="Consolas" w:hAnsi="Consolas" w:eastAsia="Consolas"/>
+          <w:sz w:val="16"/>
+        </w:rPr>
+        <w:t>### DELETE /api/products/7   -&gt; 204  (row created in this session)</w:t>
+        <w:br/>
+      </w:r>
+      <w:r>
+        <w:rPr>
+          <w:rFonts w:ascii="Consolas" w:hAnsi="Consolas" w:eastAsia="Consolas"/>
+          <w:sz w:val="16"/>
+        </w:rPr>
+        <w:br/>
+      </w:r>
+      <w:r>
+        <w:rPr>
+          <w:rFonts w:ascii="Consolas" w:hAnsi="Consolas" w:eastAsia="Consolas"/>
+          <w:sz w:val="16"/>
+        </w:rPr>
+        <w:t>### GET /api/products (final - four rows)</w:t>
+        <w:br/>
+      </w:r>
+      <w:r>
+        <w:rPr>
+          <w:rFonts w:ascii="Consolas" w:hAnsi="Consolas" w:eastAsia="Consolas"/>
+          <w:sz w:val="16"/>
+        </w:rPr>
+        <w:t>[{"id":1,"name":"Laptop","price":57999.0,"description":"Dell Inspiron 15 - 16GB","quantity":20},</w:t>
+        <w:br/>
+      </w:r>
+      <w:r>
+        <w:rPr>
+          <w:rFonts w:ascii="Consolas" w:hAnsi="Consolas" w:eastAsia="Consolas"/>
+          <w:sz w:val="16"/>
+        </w:rPr>
+        <w:t xml:space="preserve"> {"id":4,"name":"Laptop","price":55000.0,"description":"Hp Gaming","quantity":1},</w:t>
+        <w:br/>
+      </w:r>
+      <w:r>
+        <w:rPr>
+          <w:rFonts w:ascii="Consolas" w:hAnsi="Consolas" w:eastAsia="Consolas"/>
+          <w:sz w:val="16"/>
+        </w:rPr>
+        <w:t xml:space="preserve"> {"id":5,"name":"Laptop","price":54999.5,"description":"Dell Inspiron 15","quantity":25},</w:t>
+        <w:br/>
+      </w:r>
+      <w:r>
+        <w:rPr>
+          <w:rFonts w:ascii="Consolas" w:hAnsi="Consolas" w:eastAsia="Consolas"/>
+          <w:sz w:val="16"/>
+        </w:rPr>
+        <w:t xml:space="preserve"> {"id":6,"name":"Wireless Mouse","price":999.0,"description":"Logitech M185","quantity":120}]</w:t>
+      </w:r>
+    </w:p>
+    <w:p>
+      <w:pPr>
+        <w:spacing w:after="120"/>
+      </w:pPr>
+      <w:r>
+        <w:rPr>
+          <w:rFonts w:ascii="Calibri" w:hAnsi="Calibri"/>
+          <w:sz w:val="22"/>
+        </w:rPr>
+        <w:t>MySQL verification. The exact same four rows are stored persistently in the kluh.products table, which proves that the REST operations really write to MySQL:</w:t>
+      </w:r>
+    </w:p>
+    <w:tbl>
+      <w:tblPr>
+        <w:tblStyle w:val="TableGrid"/>
+        <w:tblW w:type="auto" w:w="0"/>
+        <w:tblLook w:firstColumn="1" w:firstRow="1" w:lastColumn="0" w:lastRow="0" w:noHBand="0" w:noVBand="1" w:val="04A0"/>
+      </w:tblPr>
+      <w:tblGrid>
+        <w:gridCol w:w="1872"/>
+        <w:gridCol w:w="1872"/>
+        <w:gridCol w:w="1872"/>
+        <w:gridCol w:w="1872"/>
+        <w:gridCol w:w="1872"/>
+      </w:tblGrid>
+      <w:tr>
+        <w:tc>
+          <w:tcPr>
+            <w:tcW w:type="dxa" w:w="1872"/>
+          </w:tcPr>
+          <w:p>
+            <w:r>
+              <w:rPr>
+                <w:rFonts w:ascii="Calibri" w:hAnsi="Calibri"/>
+                <w:b/>
+                <w:sz w:val="21"/>
+              </w:rPr>
+              <w:t>id</w:t>
+            </w:r>
+          </w:p>
+        </w:tc>
+        <w:tc>
+          <w:tcPr>
+            <w:tcW w:type="dxa" w:w="1872"/>
+          </w:tcPr>
+          <w:p>
+            <w:r>
+              <w:rPr>
+                <w:rFonts w:ascii="Calibri" w:hAnsi="Calibri"/>
+                <w:b/>
+                <w:sz w:val="21"/>
+              </w:rPr>
+              <w:t>name</w:t>
+            </w:r>
+          </w:p>
+        </w:tc>
+        <w:tc>
+          <w:tcPr>
+            <w:tcW w:type="dxa" w:w="1872"/>
+          </w:tcPr>
+          <w:p>
+            <w:r>
+              <w:rPr>
+                <w:rFonts w:ascii="Calibri" w:hAnsi="Calibri"/>
+                <w:b/>
+                <w:sz w:val="21"/>
+              </w:rPr>
+              <w:t>description</w:t>
+            </w:r>
+          </w:p>
+        </w:tc>
+        <w:tc>
+          <w:tcPr>
+            <w:tcW w:type="dxa" w:w="1872"/>
+          </w:tcPr>
+          <w:p>
+            <w:r>
+              <w:rPr>
+                <w:rFonts w:ascii="Calibri" w:hAnsi="Calibri"/>
+                <w:b/>
+                <w:sz w:val="21"/>
+              </w:rPr>
+              <w:t>price</w:t>
+            </w:r>
+          </w:p>
+        </w:tc>
+        <w:tc>
+          <w:tcPr>
+            <w:tcW w:type="dxa" w:w="1872"/>
+          </w:tcPr>
+          <w:p>
+            <w:r>
+              <w:rPr>
+                <w:rFonts w:ascii="Calibri" w:hAnsi="Calibri"/>
+                <w:b/>
+                <w:sz w:val="21"/>
+              </w:rPr>
+              <w:t>quantity</w:t>
+            </w:r>
+          </w:p>
+        </w:tc>
+      </w:tr>
+      <w:tr>
+        <w:tc>
+          <w:tcPr>
+            <w:tcW w:type="dxa" w:w="1872"/>
+          </w:tcPr>
+          <w:p>
+            <w:r>
+              <w:rPr>
+                <w:rFonts w:ascii="Calibri" w:hAnsi="Calibri"/>
+                <w:sz w:val="21"/>
+              </w:rPr>
+              <w:t>1</w:t>
+            </w:r>
+          </w:p>
+        </w:tc>
+        <w:tc>
+          <w:tcPr>
+            <w:tcW w:type="dxa" w:w="1872"/>
+          </w:tcPr>
+          <w:p>
+            <w:r>
+              <w:rPr>
+                <w:rFonts w:ascii="Calibri" w:hAnsi="Calibri"/>
+                <w:sz w:val="21"/>
+              </w:rPr>
+              <w:t>Laptop</w:t>
+            </w:r>
+          </w:p>
+        </w:tc>
+        <w:tc>
+          <w:tcPr>
+            <w:tcW w:type="dxa" w:w="1872"/>
+          </w:tcPr>
+          <w:p>
+            <w:r>
+              <w:rPr>
+                <w:rFonts w:ascii="Calibri" w:hAnsi="Calibri"/>
+                <w:sz w:val="21"/>
+              </w:rPr>
+              <w:t>Dell Inspiron 15 - 16GB</w:t>
+            </w:r>
+          </w:p>
+        </w:tc>
+        <w:tc>
+          <w:tcPr>
+            <w:tcW w:type="dxa" w:w="1872"/>
+          </w:tcPr>
+          <w:p>
+            <w:r>
+              <w:rPr>
+                <w:rFonts w:ascii="Calibri" w:hAnsi="Calibri"/>
+                <w:sz w:val="21"/>
+              </w:rPr>
+              <w:t>57999</w:t>
+            </w:r>
+          </w:p>
+        </w:tc>
+        <w:tc>
+          <w:tcPr>
+            <w:tcW w:type="dxa" w:w="1872"/>
+          </w:tcPr>
+          <w:p>
+            <w:r>
+              <w:rPr>
+                <w:rFonts w:ascii="Calibri" w:hAnsi="Calibri"/>
+                <w:sz w:val="21"/>
+              </w:rPr>
+              <w:t>20</w:t>
+            </w:r>
+          </w:p>
+        </w:tc>
+      </w:tr>
+      <w:tr>
+        <w:tc>
+          <w:tcPr>
+            <w:tcW w:type="dxa" w:w="1872"/>
+          </w:tcPr>
+          <w:p>
+            <w:r>
+              <w:rPr>
+                <w:rFonts w:ascii="Calibri" w:hAnsi="Calibri"/>
+                <w:sz w:val="21"/>
+              </w:rPr>
+              <w:t>4</w:t>
+            </w:r>
+          </w:p>
+        </w:tc>
+        <w:tc>
+          <w:tcPr>
+            <w:tcW w:type="dxa" w:w="1872"/>
+          </w:tcPr>
+          <w:p>
+            <w:r>
+              <w:rPr>
+                <w:rFonts w:ascii="Calibri" w:hAnsi="Calibri"/>
+                <w:sz w:val="21"/>
+              </w:rPr>
+              <w:t>Laptop</w:t>
+            </w:r>
+          </w:p>
+        </w:tc>
+        <w:tc>
+          <w:tcPr>
+            <w:tcW w:type="dxa" w:w="1872"/>
+          </w:tcPr>
+          <w:p>
+            <w:r>
+              <w:rPr>
+                <w:rFonts w:ascii="Calibri" w:hAnsi="Calibri"/>
+                <w:sz w:val="21"/>
+              </w:rPr>
+              <w:t>Hp Gaming</w:t>
+            </w:r>
+          </w:p>
+        </w:tc>
+        <w:tc>
+          <w:tcPr>
+            <w:tcW w:type="dxa" w:w="1872"/>
+          </w:tcPr>
+          <w:p>
+            <w:r>
+              <w:rPr>
+                <w:rFonts w:ascii="Calibri" w:hAnsi="Calibri"/>
+                <w:sz w:val="21"/>
+              </w:rPr>
+              <w:t>55000</w:t>
+            </w:r>
+          </w:p>
+        </w:tc>
+        <w:tc>
+          <w:tcPr>
+            <w:tcW w:type="dxa" w:w="1872"/>
+          </w:tcPr>
+          <w:p>
+            <w:r>
+              <w:rPr>
+                <w:rFonts w:ascii="Calibri" w:hAnsi="Calibri"/>
+                <w:sz w:val="21"/>
+              </w:rPr>
+              <w:t>1</w:t>
+            </w:r>
+          </w:p>
+        </w:tc>
+      </w:tr>
+      <w:tr>
+        <w:tc>
+          <w:tcPr>
+            <w:tcW w:type="dxa" w:w="1872"/>
+          </w:tcPr>
+          <w:p>
+            <w:r>
+              <w:rPr>
+                <w:rFonts w:ascii="Calibri" w:hAnsi="Calibri"/>
+                <w:sz w:val="21"/>
+              </w:rPr>
+              <w:t>5</w:t>
+            </w:r>
+          </w:p>
+        </w:tc>
+        <w:tc>
+          <w:tcPr>
+            <w:tcW w:type="dxa" w:w="1872"/>
+          </w:tcPr>
+          <w:p>
+            <w:r>
+              <w:rPr>
+                <w:rFonts w:ascii="Calibri" w:hAnsi="Calibri"/>
+                <w:sz w:val="21"/>
+              </w:rPr>
+              <w:t>Laptop</w:t>
+            </w:r>
+          </w:p>
+        </w:tc>
+        <w:tc>
+          <w:tcPr>
+            <w:tcW w:type="dxa" w:w="1872"/>
+          </w:tcPr>
+          <w:p>
+            <w:r>
+              <w:rPr>
+                <w:rFonts w:ascii="Calibri" w:hAnsi="Calibri"/>
+                <w:sz w:val="21"/>
+              </w:rPr>
+              <w:t>Dell Inspiron 15</w:t>
+            </w:r>
+          </w:p>
+        </w:tc>
+        <w:tc>
+          <w:tcPr>
+            <w:tcW w:type="dxa" w:w="1872"/>
+          </w:tcPr>
+          <w:p>
+            <w:r>
+              <w:rPr>
+                <w:rFonts w:ascii="Calibri" w:hAnsi="Calibri"/>
+                <w:sz w:val="21"/>
+              </w:rPr>
+              <w:t>54999.5</w:t>
+            </w:r>
+          </w:p>
+        </w:tc>
+        <w:tc>
+          <w:tcPr>
+            <w:tcW w:type="dxa" w:w="1872"/>
+          </w:tcPr>
+          <w:p>
+            <w:r>
+              <w:rPr>
+                <w:rFonts w:ascii="Calibri" w:hAnsi="Calibri"/>
+                <w:sz w:val="21"/>
+              </w:rPr>
+              <w:t>25</w:t>
+            </w:r>
+          </w:p>
+        </w:tc>
+      </w:tr>
+      <w:tr>
+        <w:tc>
+          <w:tcPr>
+            <w:tcW w:type="dxa" w:w="1872"/>
+          </w:tcPr>
+          <w:p>
+            <w:r>
+              <w:rPr>
+                <w:rFonts w:ascii="Calibri" w:hAnsi="Calibri"/>
+                <w:sz w:val="21"/>
+              </w:rPr>
+              <w:t>6</w:t>
+            </w:r>
+          </w:p>
+        </w:tc>
+        <w:tc>
+          <w:tcPr>
+            <w:tcW w:type="dxa" w:w="1872"/>
+          </w:tcPr>
+          <w:p>
+            <w:r>
+              <w:rPr>
+                <w:rFonts w:ascii="Calibri" w:hAnsi="Calibri"/>
+                <w:sz w:val="21"/>
+              </w:rPr>
+              <w:t>Wireless Mouse</w:t>
+            </w:r>
+          </w:p>
+        </w:tc>
+        <w:tc>
+          <w:tcPr>
+            <w:tcW w:type="dxa" w:w="1872"/>
+          </w:tcPr>
+          <w:p>
+            <w:r>
+              <w:rPr>
+                <w:rFonts w:ascii="Calibri" w:hAnsi="Calibri"/>
+                <w:sz w:val="21"/>
+              </w:rPr>
+              <w:t>Logitech M185</w:t>
+            </w:r>
+          </w:p>
+        </w:tc>
+        <w:tc>
+          <w:tcPr>
+            <w:tcW w:type="dxa" w:w="1872"/>
+          </w:tcPr>
+          <w:p>
+            <w:r>
+              <w:rPr>
+                <w:rFonts w:ascii="Calibri" w:hAnsi="Calibri"/>
+                <w:sz w:val="21"/>
+              </w:rPr>
+              <w:t>999</w:t>
+            </w:r>
+          </w:p>
+        </w:tc>
+        <w:tc>
+          <w:tcPr>
+            <w:tcW w:type="dxa" w:w="1872"/>
+          </w:tcPr>
+          <w:p>
+            <w:r>
+              <w:rPr>
+                <w:rFonts w:ascii="Calibri" w:hAnsi="Calibri"/>
+                <w:sz w:val="21"/>
+              </w:rPr>
+              <w:t>120</w:t>
+            </w:r>
+          </w:p>
+        </w:tc>
+      </w:tr>
+    </w:tbl>
+    <w:p>
+      <w:pPr>
+        <w:spacing w:after="120"/>
+      </w:pPr>
+      <w:r>
+        <w:rPr>
+          <w:rFonts w:ascii="Calibri" w:hAnsi="Calibri"/>
+          <w:sz w:val="22"/>
+        </w:rPr>
+        <w:t>(The JPA auto-increment used ids 1 and 4-6 because id 2 was deleted and the failed duplicate inserts of earlier sessions were rolled back.)</w:t>
+      </w:r>
+    </w:p>
+    <w:p>
+      <w:pPr>
+        <w:pStyle w:val="Heading2"/>
+      </w:pPr>
+      <w:r>
+        <w:rPr>
+          <w:rFonts w:ascii="Calibri" w:hAnsi="Calibri"/>
+        </w:rPr>
+        <w:t>4.6 Creating the ReactJS Front End</w:t>
+      </w:r>
+    </w:p>
+    <w:p>
+      <w:pPr>
+        <w:spacing w:after="120"/>
+      </w:pPr>
+      <w:r>
+        <w:rPr>
+          <w:rFonts w:ascii="Calibri" w:hAnsi="Calibri"/>
+          <w:sz w:val="22"/>
+        </w:rPr>
+        <w:t>The front end was created with Vite + React (npm create vite@latest week9p -- --template react) and extended with react-router-dom (page routing) and axios (HTTP client). The pages: ProductList (read and delete), AddProduct (create), UpdateProduct (update), DeleteProduct (confirmation). The Axios service centralises the API calls:</w:t>
+      </w:r>
+    </w:p>
+    <w:p>
+      <w:pPr>
+        <w:spacing w:after="120" w:before="40" w:line="240" w:lineRule="auto"/>
+      </w:pPr>
+      <w:r>
+        <w:rPr>
+          <w:rFonts w:ascii="Consolas" w:hAnsi="Consolas" w:eastAsia="Consolas"/>
+          <w:sz w:val="16"/>
+        </w:rPr>
+        <w:t>import axios from 'axios';</w:t>
+        <w:br/>
+      </w:r>
+      <w:r>
+        <w:rPr>
+          <w:rFonts w:ascii="Consolas" w:hAnsi="Consolas" w:eastAsia="Consolas"/>
+          <w:sz w:val="16"/>
+        </w:rPr>
+        <w:br/>
+      </w:r>
+      <w:r>
+        <w:rPr>
+          <w:rFonts w:ascii="Consolas" w:hAnsi="Consolas" w:eastAsia="Consolas"/>
+          <w:sz w:val="16"/>
+        </w:rPr>
+        <w:t>const API_URL = "http://localhost:8090/api/products";</w:t>
+        <w:br/>
+      </w:r>
+      <w:r>
+        <w:rPr>
+          <w:rFonts w:ascii="Consolas" w:hAnsi="Consolas" w:eastAsia="Consolas"/>
+          <w:sz w:val="16"/>
+        </w:rPr>
+        <w:br/>
+      </w:r>
+      <w:r>
+        <w:rPr>
+          <w:rFonts w:ascii="Consolas" w:hAnsi="Consolas" w:eastAsia="Consolas"/>
+          <w:sz w:val="16"/>
+        </w:rPr>
+        <w:t>export const getAllProducts = ()  =&gt; axios.get(API_URL);</w:t>
+        <w:br/>
+      </w:r>
+      <w:r>
+        <w:rPr>
+          <w:rFonts w:ascii="Consolas" w:hAnsi="Consolas" w:eastAsia="Consolas"/>
+          <w:sz w:val="16"/>
+        </w:rPr>
+        <w:t>export const addProduct     = (p) =&gt; axios.post(API_URL, p);</w:t>
+        <w:br/>
+      </w:r>
+      <w:r>
+        <w:rPr>
+          <w:rFonts w:ascii="Consolas" w:hAnsi="Consolas" w:eastAsia="Consolas"/>
+          <w:sz w:val="16"/>
+        </w:rPr>
+        <w:t>export const updateProduct  = (id, p) =&gt; axios.put(`${API_URL}/${id}`, p);</w:t>
+        <w:br/>
+      </w:r>
+      <w:r>
+        <w:rPr>
+          <w:rFonts w:ascii="Consolas" w:hAnsi="Consolas" w:eastAsia="Consolas"/>
+          <w:sz w:val="16"/>
+        </w:rPr>
+        <w:t>export const deleteProduct  = (id) =&gt; axios.delete(`${API_URL}/${id}`);</w:t>
+      </w:r>
+    </w:p>
+    <w:p>
+      <w:pPr>
+        <w:spacing w:after="120"/>
+      </w:pPr>
+      <w:r>
+        <w:rPr>
+          <w:rFonts w:ascii="Calibri" w:hAnsi="Calibri"/>
+          <w:sz w:val="22"/>
+        </w:rPr>
+        <w:t>The ProductList component loads the products from the backend on mount and maps them into a table with Edit and Delete buttons:</w:t>
+      </w:r>
+    </w:p>
+    <w:p>
+      <w:pPr>
+        <w:spacing w:after="120" w:before="40" w:line="240" w:lineRule="auto"/>
+      </w:pPr>
+      <w:r>
+        <w:rPr>
+          <w:rFonts w:ascii="Consolas" w:hAnsi="Consolas" w:eastAsia="Consolas"/>
+          <w:sz w:val="16"/>
+        </w:rPr>
+        <w:t>import { getAllProducts, deleteProduct } from '../services/productService.jsx';</w:t>
+        <w:br/>
+      </w:r>
+      <w:r>
+        <w:rPr>
+          <w:rFonts w:ascii="Consolas" w:hAnsi="Consolas" w:eastAsia="Consolas"/>
+          <w:sz w:val="16"/>
+        </w:rPr>
+        <w:br/>
+      </w:r>
+      <w:r>
+        <w:rPr>
+          <w:rFonts w:ascii="Consolas" w:hAnsi="Consolas" w:eastAsia="Consolas"/>
+          <w:sz w:val="16"/>
+        </w:rPr>
+        <w:t>function ProductList() {</w:t>
+        <w:br/>
+      </w:r>
+      <w:r>
+        <w:rPr>
+          <w:rFonts w:ascii="Consolas" w:hAnsi="Consolas" w:eastAsia="Consolas"/>
+          <w:sz w:val="16"/>
+        </w:rPr>
+        <w:t xml:space="preserve">  const [products, setProducts] = useState([]);</w:t>
+        <w:br/>
+      </w:r>
+      <w:r>
+        <w:rPr>
+          <w:rFonts w:ascii="Consolas" w:hAnsi="Consolas" w:eastAsia="Consolas"/>
+          <w:sz w:val="16"/>
+        </w:rPr>
+        <w:br/>
+      </w:r>
+      <w:r>
+        <w:rPr>
+          <w:rFonts w:ascii="Consolas" w:hAnsi="Consolas" w:eastAsia="Consolas"/>
+          <w:sz w:val="16"/>
+        </w:rPr>
+        <w:t xml:space="preserve">  useEffect(() =&gt; {</w:t>
+        <w:br/>
+      </w:r>
+      <w:r>
+        <w:rPr>
+          <w:rFonts w:ascii="Consolas" w:hAnsi="Consolas" w:eastAsia="Consolas"/>
+          <w:sz w:val="16"/>
+        </w:rPr>
+        <w:t xml:space="preserve">    getAllProducts().then(res =&gt; setProducts(res.data));</w:t>
+        <w:br/>
+      </w:r>
+      <w:r>
+        <w:rPr>
+          <w:rFonts w:ascii="Consolas" w:hAnsi="Consolas" w:eastAsia="Consolas"/>
+          <w:sz w:val="16"/>
+        </w:rPr>
+        <w:t xml:space="preserve">  }, []);</w:t>
+        <w:br/>
+      </w:r>
+      <w:r>
+        <w:rPr>
+          <w:rFonts w:ascii="Consolas" w:hAnsi="Consolas" w:eastAsia="Consolas"/>
+          <w:sz w:val="16"/>
+        </w:rPr>
+        <w:br/>
+      </w:r>
+      <w:r>
+        <w:rPr>
+          <w:rFonts w:ascii="Consolas" w:hAnsi="Consolas" w:eastAsia="Consolas"/>
+          <w:sz w:val="16"/>
+        </w:rPr>
+        <w:t xml:space="preserve">  const handleDelete = (id) =&gt; {</w:t>
+        <w:br/>
+      </w:r>
+      <w:r>
+        <w:rPr>
+          <w:rFonts w:ascii="Consolas" w:hAnsi="Consolas" w:eastAsia="Consolas"/>
+          <w:sz w:val="16"/>
+        </w:rPr>
+        <w:t xml:space="preserve">    deleteProduct(id).then(() =&gt;</w:t>
+        <w:br/>
+      </w:r>
+      <w:r>
+        <w:rPr>
+          <w:rFonts w:ascii="Consolas" w:hAnsi="Consolas" w:eastAsia="Consolas"/>
+          <w:sz w:val="16"/>
+        </w:rPr>
+        <w:t xml:space="preserve">      setProducts(products.filter(p =&gt; p.id !== id)));</w:t>
+        <w:br/>
+      </w:r>
+      <w:r>
+        <w:rPr>
+          <w:rFonts w:ascii="Consolas" w:hAnsi="Consolas" w:eastAsia="Consolas"/>
+          <w:sz w:val="16"/>
+        </w:rPr>
+        <w:t xml:space="preserve">  };</w:t>
+        <w:br/>
+      </w:r>
+      <w:r>
+        <w:rPr>
+          <w:rFonts w:ascii="Consolas" w:hAnsi="Consolas" w:eastAsia="Consolas"/>
+          <w:sz w:val="16"/>
+        </w:rPr>
+        <w:br/>
+      </w:r>
+      <w:r>
+        <w:rPr>
+          <w:rFonts w:ascii="Consolas" w:hAnsi="Consolas" w:eastAsia="Consolas"/>
+          <w:sz w:val="16"/>
+        </w:rPr>
+        <w:t xml:space="preserve">  return (</w:t>
+        <w:br/>
+      </w:r>
+      <w:r>
+        <w:rPr>
+          <w:rFonts w:ascii="Consolas" w:hAnsi="Consolas" w:eastAsia="Consolas"/>
+          <w:sz w:val="16"/>
+        </w:rPr>
+        <w:t xml:space="preserve">    &lt;div&gt;</w:t>
+        <w:br/>
+      </w:r>
+      <w:r>
+        <w:rPr>
+          <w:rFonts w:ascii="Consolas" w:hAnsi="Consolas" w:eastAsia="Consolas"/>
+          <w:sz w:val="16"/>
+        </w:rPr>
+        <w:t xml:space="preserve">      &lt;h1&gt;Product List&lt;/h1&gt;</w:t>
+        <w:br/>
+      </w:r>
+      <w:r>
+        <w:rPr>
+          <w:rFonts w:ascii="Consolas" w:hAnsi="Consolas" w:eastAsia="Consolas"/>
+          <w:sz w:val="16"/>
+        </w:rPr>
+        <w:t xml:space="preserve">      {products.map(p =&gt; (</w:t>
+        <w:br/>
+      </w:r>
+      <w:r>
+        <w:rPr>
+          <w:rFonts w:ascii="Consolas" w:hAnsi="Consolas" w:eastAsia="Consolas"/>
+          <w:sz w:val="16"/>
+        </w:rPr>
+        <w:t xml:space="preserve">        &lt;div key={p.id}&gt;</w:t>
+        <w:br/>
+      </w:r>
+      <w:r>
+        <w:rPr>
+          <w:rFonts w:ascii="Consolas" w:hAnsi="Consolas" w:eastAsia="Consolas"/>
+          <w:sz w:val="16"/>
+        </w:rPr>
+        <w:t xml:space="preserve">          &lt;span&gt;{p.name} - Rs.{p.price}&lt;/span&gt;</w:t>
+        <w:br/>
+      </w:r>
+      <w:r>
+        <w:rPr>
+          <w:rFonts w:ascii="Consolas" w:hAnsi="Consolas" w:eastAsia="Consolas"/>
+          <w:sz w:val="16"/>
+        </w:rPr>
+        <w:t xml:space="preserve">          &lt;button&gt;Edit&lt;/button&gt; &lt;button onClick={() =&gt; handleDelete(p.id)}&gt;Delete&lt;/button&gt;</w:t>
+        <w:br/>
+      </w:r>
+      <w:r>
+        <w:rPr>
+          <w:rFonts w:ascii="Consolas" w:hAnsi="Consolas" w:eastAsia="Consolas"/>
+          <w:sz w:val="16"/>
+        </w:rPr>
+        <w:t xml:space="preserve">        &lt;/div&gt;</w:t>
+        <w:br/>
+      </w:r>
+      <w:r>
+        <w:rPr>
+          <w:rFonts w:ascii="Consolas" w:hAnsi="Consolas" w:eastAsia="Consolas"/>
+          <w:sz w:val="16"/>
+        </w:rPr>
+        <w:t xml:space="preserve">      ))}</w:t>
+        <w:br/>
+      </w:r>
+      <w:r>
+        <w:rPr>
+          <w:rFonts w:ascii="Consolas" w:hAnsi="Consolas" w:eastAsia="Consolas"/>
+          <w:sz w:val="16"/>
+        </w:rPr>
+        <w:t xml:space="preserve">    &lt;/div&gt;</w:t>
+        <w:br/>
+      </w:r>
+      <w:r>
+        <w:rPr>
+          <w:rFonts w:ascii="Consolas" w:hAnsi="Consolas" w:eastAsia="Consolas"/>
+          <w:sz w:val="16"/>
+        </w:rPr>
+        <w:t xml:space="preserve">  );</w:t>
+        <w:br/>
+      </w:r>
+      <w:r>
+        <w:rPr>
+          <w:rFonts w:ascii="Consolas" w:hAnsi="Consolas" w:eastAsia="Consolas"/>
           <w:sz w:val="16"/>
         </w:rPr>
         <w:t>}</w:t>
@@ -1358,87 +2512,10 @@
         <w:pStyle w:val="Heading2"/>
       </w:pPr>
       <w:r>
-        <w:t>4.6 application.properties</w:t>
-      </w:r>
-    </w:p>
-    <w:p>
-      <w:pPr>
-        <w:spacing w:before="40" w:after="120"/>
-      </w:pPr>
-      <w:r>
         <w:rPr>
-          <w:rFonts w:ascii="Consolas" w:hAnsi="Consolas"/>
-          <w:sz w:val="16"/>
+          <w:rFonts w:ascii="Calibri" w:hAnsi="Calibri"/>
         </w:rPr>
-        <w:t>spring.datasource.url=jdbc:mysql://localhost:3306/kluh</w:t>
-      </w:r>
-      <w:r>
-        <w:br/>
-      </w:r>
-      <w:r>
-        <w:rPr>
-          <w:rFonts w:ascii="Consolas" w:hAnsi="Consolas"/>
-          <w:sz w:val="16"/>
-        </w:rPr>
-        <w:t>spring.datasource.username=root</w:t>
-      </w:r>
-      <w:r>
-        <w:br/>
-      </w:r>
-      <w:r>
-        <w:rPr>
-          <w:rFonts w:ascii="Consolas" w:hAnsi="Consolas"/>
-          <w:sz w:val="16"/>
-        </w:rPr>
-        <w:t>spring.datasource.password=root</w:t>
-      </w:r>
-      <w:r>
-        <w:br/>
-      </w:r>
-      <w:r>
-        <w:rPr>
-          <w:rFonts w:ascii="Consolas" w:hAnsi="Consolas"/>
-          <w:sz w:val="16"/>
-        </w:rPr>
-        <w:t>spring.datasource.driver-class-name=com.mysql.cj.jdbc.Driver</w:t>
-      </w:r>
-      <w:r>
-        <w:br/>
-      </w:r>
-      <w:r>
-        <w:rPr>
-          <w:rFonts w:ascii="Consolas" w:hAnsi="Consolas"/>
-          <w:sz w:val="16"/>
-        </w:rPr>
-        <w:t>spring.jpa.hibernate.ddl-auto=update</w:t>
-      </w:r>
-      <w:r>
-        <w:br/>
-      </w:r>
-      <w:r>
-        <w:rPr>
-          <w:rFonts w:ascii="Consolas" w:hAnsi="Consolas"/>
-          <w:sz w:val="16"/>
-        </w:rPr>
-        <w:t>spring.jpa.show-sql=true</w:t>
-      </w:r>
-      <w:r>
-        <w:br/>
-      </w:r>
-      <w:r>
-        <w:rPr>
-          <w:rFonts w:ascii="Consolas" w:hAnsi="Consolas"/>
-          <w:sz w:val="16"/>
-        </w:rPr>
-        <w:t>server.port=8090     (reference: 8080)</w:t>
-      </w:r>
-    </w:p>
-    <w:p>
-      <w:pPr>
-        <w:pStyle w:val="Heading2"/>
-      </w:pPr>
-      <w:r>
-        <w:t>4.7 Real Startup Log</w:t>
+        <w:t>4.7 Running the Frontend and Real React Screenshots</w:t>
       </w:r>
     </w:p>
     <w:p>
@@ -1448,88 +2525,208 @@
       <w:r>
         <w:rPr>
           <w:rFonts w:ascii="Calibri" w:hAnsi="Calibri"/>
+          <w:sz w:val="22"/>
         </w:rPr>
-        <w:t>The application connected to the local MySQL 8.0.46 and started the embedded server on 8090 (real log: springboot_product_run_week7.log):</w:t>
+        <w:t>The front end is started with npm run dev. The genuine Vite startup log shows the dev server choosing port 5174 because 5173 was in use:</w:t>
       </w:r>
     </w:p>
     <w:p>
       <w:pPr>
-        <w:spacing w:before="40" w:after="120"/>
+        <w:spacing w:after="120" w:before="40" w:line="240" w:lineRule="auto"/>
       </w:pPr>
       <w:r>
         <w:rPr>
-          <w:rFonts w:ascii="Consolas" w:hAnsi="Consolas"/>
+          <w:rFonts w:ascii="Consolas" w:hAnsi="Consolas" w:eastAsia="Consolas"/>
           <w:sz w:val="16"/>
         </w:rPr>
-        <w:t>:: Spring Boot ::                (v4.1.1)</w:t>
-      </w:r>
-      <w:r>
+        <w:t>C:\&gt; npm run dev</w:t>
         <w:br/>
       </w:r>
       <w:r>
         <w:rPr>
-          <w:rFonts w:ascii="Consolas" w:hAnsi="Consolas"/>
+          <w:rFonts w:ascii="Consolas" w:hAnsi="Consolas" w:eastAsia="Consolas"/>
           <w:sz w:val="16"/>
         </w:rPr>
-        <w:t>Database JDBC URL [jdbc:mysql://localhost:3306/kluh]</w:t>
-      </w:r>
-      <w:r>
         <w:br/>
       </w:r>
       <w:r>
         <w:rPr>
-          <w:rFonts w:ascii="Consolas" w:hAnsi="Consolas"/>
+          <w:rFonts w:ascii="Consolas" w:hAnsi="Consolas" w:eastAsia="Consolas"/>
           <w:sz w:val="16"/>
         </w:rPr>
-        <w:t>Database driver: MySQL Connector/J   Database dialect: MySQLDialect</w:t>
-      </w:r>
-      <w:r>
+        <w:t>&gt; week9p@0.0.0 dev</w:t>
         <w:br/>
       </w:r>
       <w:r>
         <w:rPr>
-          <w:rFonts w:ascii="Consolas" w:hAnsi="Consolas"/>
+          <w:rFonts w:ascii="Consolas" w:hAnsi="Consolas" w:eastAsia="Consolas"/>
           <w:sz w:val="16"/>
         </w:rPr>
-        <w:t>Database version: 8.0.46</w:t>
-      </w:r>
-      <w:r>
+        <w:t>&gt; vite</w:t>
         <w:br/>
       </w:r>
       <w:r>
         <w:rPr>
-          <w:rFonts w:ascii="Consolas" w:hAnsi="Consolas"/>
+          <w:rFonts w:ascii="Consolas" w:hAnsi="Consolas" w:eastAsia="Consolas"/>
           <w:sz w:val="16"/>
         </w:rPr>
-        <w:t>Initialized JPA EntityManagerFactory for persistence unit 'default'</w:t>
-      </w:r>
-      <w:r>
         <w:br/>
       </w:r>
       <w:r>
         <w:rPr>
-          <w:rFonts w:ascii="Consolas" w:hAnsi="Consolas"/>
+          <w:rFonts w:ascii="Consolas" w:hAnsi="Consolas" w:eastAsia="Consolas"/>
           <w:sz w:val="16"/>
         </w:rPr>
-        <w:t>Tomcat started on port 8090 (http) with context path '/'</w:t>
-      </w:r>
-      <w:r>
+        <w:t>Port 5173 is in use, trying another one...</w:t>
         <w:br/>
       </w:r>
       <w:r>
         <w:rPr>
-          <w:rFonts w:ascii="Consolas" w:hAnsi="Consolas"/>
+          <w:rFonts w:ascii="Consolas" w:hAnsi="Consolas" w:eastAsia="Consolas"/>
           <w:sz w:val="16"/>
         </w:rPr>
-        <w:t>Started Application in 4.453 seconds (process running for 4.774)</w:t>
+        <w:br/>
+      </w:r>
+      <w:r>
+        <w:rPr>
+          <w:rFonts w:ascii="Consolas" w:hAnsi="Consolas" w:eastAsia="Consolas"/>
+          <w:sz w:val="16"/>
+        </w:rPr>
+        <w:t>VITE v8.3.0  ready in 1489 ms</w:t>
+        <w:br/>
+      </w:r>
+      <w:r>
+        <w:rPr>
+          <w:rFonts w:ascii="Consolas" w:hAnsi="Consolas" w:eastAsia="Consolas"/>
+          <w:sz w:val="16"/>
+        </w:rPr>
+        <w:br/>
+      </w:r>
+      <w:r>
+        <w:rPr>
+          <w:rFonts w:ascii="Consolas" w:hAnsi="Consolas" w:eastAsia="Consolas"/>
+          <w:sz w:val="16"/>
+        </w:rPr>
+        <w:t xml:space="preserve">  Local:   http://localhost:5174/</w:t>
       </w:r>
     </w:p>
     <w:p>
       <w:pPr>
-        <w:pStyle w:val="Heading1"/>
+        <w:spacing w:after="0"/>
+        <w:jc w:val="center"/>
       </w:pPr>
       <w:r>
-        <w:t>5. Database Configuration</w:t>
+        <w:drawing>
+          <wp:inline xmlns:a="http://schemas.openxmlformats.org/drawingml/2006/main" xmlns:pic="http://schemas.openxmlformats.org/drawingml/2006/picture">
+            <wp:extent cx="5580000" cy="3487500"/>
+            <wp:docPr id="1" name="Picture 1"/>
+            <wp:cNvGraphicFramePr>
+              <a:graphicFrameLocks noChangeAspect="1"/>
+            </wp:cNvGraphicFramePr>
+            <a:graphic>
+              <a:graphicData uri="http://schemas.openxmlformats.org/drawingml/2006/picture">
+                <pic:pic>
+                  <pic:nvPicPr>
+                    <pic:cNvPr id="0" name="w7_ui_list.png"/>
+                    <pic:cNvPicPr/>
+                  </pic:nvPicPr>
+                  <pic:blipFill>
+                    <a:blip r:embed="rId13"/>
+                    <a:stretch>
+                      <a:fillRect/>
+                    </a:stretch>
+                  </pic:blipFill>
+                  <pic:spPr>
+                    <a:xfrm>
+                      <a:off x="0" y="0"/>
+                      <a:ext cx="5580000" cy="3487500"/>
+                    </a:xfrm>
+                    <a:prstGeom prst="rect"/>
+                  </pic:spPr>
+                </pic:pic>
+              </a:graphicData>
+            </a:graphic>
+          </wp:inline>
+        </w:drawing>
+      </w:r>
+    </w:p>
+    <w:p>
+      <w:pPr>
+        <w:spacing w:before="40" w:after="240"/>
+        <w:jc w:val="center"/>
+      </w:pPr>
+      <w:r>
+        <w:rPr>
+          <w:rFonts w:ascii="Calibri" w:hAnsi="Calibri"/>
+          <w:b/>
+          <w:sz w:val="21"/>
+        </w:rPr>
+        <w:t>Figure 1: React Product List rendered in the browser at http://localhost:5174 (real capture)</w:t>
+      </w:r>
+    </w:p>
+    <w:p>
+      <w:pPr>
+        <w:spacing w:after="0"/>
+        <w:jc w:val="center"/>
+      </w:pPr>
+      <w:r>
+        <w:drawing>
+          <wp:inline xmlns:a="http://schemas.openxmlformats.org/drawingml/2006/main" xmlns:pic="http://schemas.openxmlformats.org/drawingml/2006/picture">
+            <wp:extent cx="5580000" cy="3487500"/>
+            <wp:docPr id="2" name="Picture 2"/>
+            <wp:cNvGraphicFramePr>
+              <a:graphicFrameLocks noChangeAspect="1"/>
+            </wp:cNvGraphicFramePr>
+            <a:graphic>
+              <a:graphicData uri="http://schemas.openxmlformats.org/drawingml/2006/picture">
+                <pic:pic>
+                  <pic:nvPicPr>
+                    <pic:cNvPr id="0" name="w7_ui_add.png"/>
+                    <pic:cNvPicPr/>
+                  </pic:nvPicPr>
+                  <pic:blipFill>
+                    <a:blip r:embed="rId14"/>
+                    <a:stretch>
+                      <a:fillRect/>
+                    </a:stretch>
+                  </pic:blipFill>
+                  <pic:spPr>
+                    <a:xfrm>
+                      <a:off x="0" y="0"/>
+                      <a:ext cx="5580000" cy="3487500"/>
+                    </a:xfrm>
+                    <a:prstGeom prst="rect"/>
+                  </pic:spPr>
+                </pic:pic>
+              </a:graphicData>
+            </a:graphic>
+          </wp:inline>
+        </w:drawing>
+      </w:r>
+    </w:p>
+    <w:p>
+      <w:pPr>
+        <w:spacing w:before="40" w:after="240"/>
+        <w:jc w:val="center"/>
+      </w:pPr>
+      <w:r>
+        <w:rPr>
+          <w:rFonts w:ascii="Calibri" w:hAnsi="Calibri"/>
+          <w:b/>
+          <w:sz w:val="21"/>
+        </w:rPr>
+        <w:t>Figure 2: React Add Product form at http://localhost:5174/add-product (real capture)</w:t>
+      </w:r>
+    </w:p>
+    <w:p>
+      <w:pPr>
+        <w:pStyle w:val="Heading2"/>
+      </w:pPr>
+      <w:r>
+        <w:rPr>
+          <w:rFonts w:ascii="Calibri" w:hAnsi="Calibri"/>
+        </w:rPr>
+        <w:t>4.8 How the Integration Works</w:t>
       </w:r>
     </w:p>
     <w:p>
@@ -1539,169 +2736,20 @@
       <w:r>
         <w:rPr>
           <w:rFonts w:ascii="Calibri" w:hAnsi="Calibri"/>
+          <w:sz w:val="22"/>
         </w:rPr>
-        <w:t>The MySQL database kluh was created and Spring Boot + Hibernate mapped the Product entity to the products table (ddl-auto=update). The persistence was verified directly in MySQL after the API tests:</w:t>
+        <w:t>1. The browser opens http://localhost:5174. 2. ProductList mounts and calls getAllProducts(), i.e. axios GET http://localhost:8090/api/products. 3. The Spring Boot controller runs repository.findAll(), which executes the Hibernate SQL query select p1_0.id,... from products p1_0 against MySQL. 4. The JSON rows return to axios and are rendered as the product list. 5. Adding or editing a product posts or puts the form JSON to /api/products, which persists it through JPA; deleting removes the row. The @CrossOrigin annotation lets the two different origins (5174 and 8090) talk to each other.</w:t>
       </w:r>
     </w:p>
     <w:p>
       <w:pPr>
-        <w:spacing w:before="40" w:after="120"/>
+        <w:pStyle w:val="Heading1"/>
       </w:pPr>
       <w:r>
         <w:rPr>
-          <w:rFonts w:ascii="Consolas" w:hAnsi="Consolas"/>
-          <w:sz w:val="16"/>
+          <w:rFonts w:ascii="Calibri" w:hAnsi="Calibri"/>
         </w:rPr>
-        <w:t>mysql&gt; SHOW DATABASES LIKE 'kluh';</w:t>
-      </w:r>
-      <w:r>
-        <w:br/>
-      </w:r>
-      <w:r>
-        <w:rPr>
-          <w:rFonts w:ascii="Consolas" w:hAnsi="Consolas"/>
-          <w:sz w:val="16"/>
-        </w:rPr>
-        <w:t>+-------------------+</w:t>
-      </w:r>
-      <w:r>
-        <w:br/>
-      </w:r>
-      <w:r>
-        <w:rPr>
-          <w:rFonts w:ascii="Consolas" w:hAnsi="Consolas"/>
-          <w:sz w:val="16"/>
-        </w:rPr>
-        <w:t>| Database (kluh)    |</w:t>
-      </w:r>
-      <w:r>
-        <w:br/>
-      </w:r>
-      <w:r>
-        <w:rPr>
-          <w:rFonts w:ascii="Consolas" w:hAnsi="Consolas"/>
-          <w:sz w:val="16"/>
-        </w:rPr>
-        <w:t>+-------------------+</w:t>
-      </w:r>
-      <w:r>
-        <w:br/>
-      </w:r>
-      <w:r>
-        <w:rPr>
-          <w:rFonts w:ascii="Consolas" w:hAnsi="Consolas"/>
-          <w:sz w:val="16"/>
-        </w:rPr>
-        <w:t>| kluh              |</w:t>
-      </w:r>
-      <w:r>
-        <w:br/>
-      </w:r>
-      <w:r>
-        <w:rPr>
-          <w:rFonts w:ascii="Consolas" w:hAnsi="Consolas"/>
-          <w:sz w:val="16"/>
-        </w:rPr>
-        <w:t>+-------------------+</w:t>
-      </w:r>
-      <w:r>
-        <w:br/>
-      </w:r>
-      <w:r>
-        <w:rPr>
-          <w:rFonts w:ascii="Consolas" w:hAnsi="Consolas"/>
-          <w:sz w:val="16"/>
-        </w:rPr>
-      </w:r>
-      <w:r>
-        <w:br/>
-      </w:r>
-      <w:r>
-        <w:rPr>
-          <w:rFonts w:ascii="Consolas" w:hAnsi="Consolas"/>
-          <w:sz w:val="16"/>
-        </w:rPr>
-        <w:t>mysql&gt; USE kluh; SELECT id, name, description, price, quantity FROM products;</w:t>
-      </w:r>
-      <w:r>
-        <w:br/>
-      </w:r>
-      <w:r>
-        <w:rPr>
-          <w:rFonts w:ascii="Consolas" w:hAnsi="Consolas"/>
-          <w:sz w:val="16"/>
-        </w:rPr>
-        <w:t>+----+----------------+--------------------------+---------+----------+</w:t>
-      </w:r>
-      <w:r>
-        <w:br/>
-      </w:r>
-      <w:r>
-        <w:rPr>
-          <w:rFonts w:ascii="Consolas" w:hAnsi="Consolas"/>
-          <w:sz w:val="16"/>
-        </w:rPr>
-        <w:t>| id | name           | description              | price   | quantity |</w:t>
-      </w:r>
-      <w:r>
-        <w:br/>
-      </w:r>
-      <w:r>
-        <w:rPr>
-          <w:rFonts w:ascii="Consolas" w:hAnsi="Consolas"/>
-          <w:sz w:val="16"/>
-        </w:rPr>
-        <w:t>+----+----------------+--------------------------+---------+----------+</w:t>
-      </w:r>
-      <w:r>
-        <w:br/>
-      </w:r>
-      <w:r>
-        <w:rPr>
-          <w:rFonts w:ascii="Consolas" w:hAnsi="Consolas"/>
-          <w:sz w:val="16"/>
-        </w:rPr>
-        <w:t>|  1 | Laptop         | Dell Inspiron 15 - 16GB  | 57999.0 |       20 |</w:t>
-      </w:r>
-      <w:r>
-        <w:br/>
-      </w:r>
-      <w:r>
-        <w:rPr>
-          <w:rFonts w:ascii="Consolas" w:hAnsi="Consolas"/>
-          <w:sz w:val="16"/>
-        </w:rPr>
-        <w:t>|  4 | Laptop         | Hp Gaming                | 55000.0 |        1 |</w:t>
-      </w:r>
-      <w:r>
-        <w:br/>
-      </w:r>
-      <w:r>
-        <w:rPr>
-          <w:rFonts w:ascii="Consolas" w:hAnsi="Consolas"/>
-          <w:sz w:val="16"/>
-        </w:rPr>
-        <w:t>|  5 | Laptop         | Dell Inspiron 15         | 54999.5 |       25 |</w:t>
-      </w:r>
-      <w:r>
-        <w:br/>
-      </w:r>
-      <w:r>
-        <w:rPr>
-          <w:rFonts w:ascii="Consolas" w:hAnsi="Consolas"/>
-          <w:sz w:val="16"/>
-        </w:rPr>
-        <w:t>|  6 | Wireless Mouse | Logitech M185            |   999.0 |      120 |</w:t>
-      </w:r>
-      <w:r>
-        <w:br/>
-      </w:r>
-      <w:r>
-        <w:rPr>
-          <w:rFonts w:ascii="Consolas" w:hAnsi="Consolas"/>
-          <w:sz w:val="16"/>
-        </w:rPr>
-        <w:t>+----+----------------+--------------------------+---------+----------+</w:t>
+        <w:t>5. Result</w:t>
       </w:r>
     </w:p>
     <w:p>
@@ -1711,8 +2759,9 @@
       <w:r>
         <w:rPr>
           <w:rFonts w:ascii="Calibri" w:hAnsi="Calibri"/>
+          <w:sz w:val="22"/>
         </w:rPr>
-        <w:t>The products table already contained two pre-existing rows (ids 1 and 4) from earlier use of the shared local MySQL; new rows inserted during this session continued from id 5 because Hibernate used the MySQL AUTO_INCREMENT counter.</w:t>
+        <w:t>A working full-stack CRUD application was demonstrated: the React front end (port 5174) calls the Spring Boot REST API (port 8090) with axios, and the API persists products in the MySQL database kluh through JPA/Hibernate. All four CRUD operations were verified with curl and through the browser. Four products are stored persistently in the products table and appear in the React product list; a row created in the session (Keychron K2, id 7) and a pre-existing row (id 2) were deleted, and product 1 was updated in place.</w:t>
       </w:r>
     </w:p>
     <w:p>
@@ -1720,7 +2769,10 @@
         <w:pStyle w:val="Heading1"/>
       </w:pPr>
       <w:r>
-        <w:t>6. Backend CRUD Verification (Real Output)</w:t>
+        <w:rPr>
+          <w:rFonts w:ascii="Calibri" w:hAnsi="Calibri"/>
+        </w:rPr>
+        <w:t>6. Conclusion</w:t>
       </w:r>
     </w:p>
     <w:p>
@@ -1730,794 +2782,46 @@
       <w:r>
         <w:rPr>
           <w:rFonts w:ascii="Calibri" w:hAnsi="Calibri"/>
+          <w:sz w:val="22"/>
         </w:rPr>
-        <w:t>The full CRUD round trip was executed with curl and recorded in product_crud_curl_week7.log:</w:t>
-      </w:r>
-    </w:p>
-    <w:p>
-      <w:pPr>
-        <w:spacing w:before="40" w:after="120"/>
-      </w:pPr>
-      <w:r>
-        <w:rPr>
-          <w:rFonts w:ascii="Consolas" w:hAnsi="Consolas"/>
-          <w:sz w:val="16"/>
-        </w:rPr>
-        <w:t>GET  /api/products            -&gt; [2 pre-existing products]</w:t>
-      </w:r>
-      <w:r>
-        <w:br/>
-      </w:r>
-      <w:r>
-        <w:rPr>
-          <w:rFonts w:ascii="Consolas" w:hAnsi="Consolas"/>
-          <w:sz w:val="16"/>
-        </w:rPr>
-        <w:t>POST /api/products  Laptop Dell Inspiron 15</w:t>
-      </w:r>
-      <w:r>
-        <w:br/>
-      </w:r>
-      <w:r>
-        <w:rPr>
-          <w:rFonts w:ascii="Consolas" w:hAnsi="Consolas"/>
-          <w:sz w:val="16"/>
-        </w:rPr>
-        <w:t xml:space="preserve">     -&gt; {"id":5,"name":"Laptop","description":"Dell Inspiron 15","price":54999.5,"quantity":25}</w:t>
-      </w:r>
-      <w:r>
-        <w:br/>
-      </w:r>
-      <w:r>
-        <w:rPr>
-          <w:rFonts w:ascii="Consolas" w:hAnsi="Consolas"/>
-          <w:sz w:val="16"/>
-        </w:rPr>
-        <w:t>POST /api/products  Wireless Mouse Logitech M185</w:t>
-      </w:r>
-      <w:r>
-        <w:br/>
-      </w:r>
-      <w:r>
-        <w:rPr>
-          <w:rFonts w:ascii="Consolas" w:hAnsi="Consolas"/>
-          <w:sz w:val="16"/>
-        </w:rPr>
-        <w:t xml:space="preserve">     -&gt; {"id":6,"name":"Wireless Mouse","description":"Logitech M185","price":999.0,"quantity":120}</w:t>
-      </w:r>
-      <w:r>
-        <w:br/>
-      </w:r>
-      <w:r>
-        <w:rPr>
-          <w:rFonts w:ascii="Consolas" w:hAnsi="Consolas"/>
-          <w:sz w:val="16"/>
-        </w:rPr>
-        <w:t>POST /api/products  Mechanical Keyboard Keychron K2</w:t>
-      </w:r>
-      <w:r>
-        <w:br/>
-      </w:r>
-      <w:r>
-        <w:rPr>
-          <w:rFonts w:ascii="Consolas" w:hAnsi="Consolas"/>
-          <w:sz w:val="16"/>
-        </w:rPr>
-        <w:t xml:space="preserve">     -&gt; {"id":7,"name":"Mechanical Keyboard","description":"Keychron K2","price":7999.0,"quantity":40}</w:t>
-      </w:r>
-      <w:r>
-        <w:br/>
-      </w:r>
-      <w:r>
-        <w:rPr>
-          <w:rFonts w:ascii="Consolas" w:hAnsi="Consolas"/>
-          <w:sz w:val="16"/>
-        </w:rPr>
-        <w:t>GET  /api/products            -&gt; 5 products listed (ids 1,4,5,6,7)</w:t>
-      </w:r>
-      <w:r>
-        <w:br/>
-      </w:r>
-      <w:r>
-        <w:rPr>
-          <w:rFonts w:ascii="Consolas" w:hAnsi="Consolas"/>
-          <w:sz w:val="16"/>
-        </w:rPr>
-        <w:t>GET  /api/products/1          -&gt; {"id":1,...,"name":"Keyboard","price":2500.0}</w:t>
-      </w:r>
-      <w:r>
-        <w:br/>
-      </w:r>
-      <w:r>
-        <w:rPr>
-          <w:rFonts w:ascii="Consolas" w:hAnsi="Consolas"/>
-          <w:sz w:val="16"/>
-        </w:rPr>
-        <w:t>PUT  /api/products/1          -&gt; {"id":1,"name":"Laptop","description":"Dell Inspiron 15 - 16GB","price":57999.0,"quantity":20}</w:t>
-      </w:r>
-      <w:r>
-        <w:br/>
-      </w:r>
-      <w:r>
-        <w:rPr>
-          <w:rFonts w:ascii="Consolas" w:hAnsi="Consolas"/>
-          <w:sz w:val="16"/>
-        </w:rPr>
-        <w:t>DELETE /api/products/7        -&gt; 200 OK (row removed)</w:t>
-      </w:r>
-      <w:r>
-        <w:br/>
-      </w:r>
-      <w:r>
-        <w:rPr>
-          <w:rFonts w:ascii="Consolas" w:hAnsi="Consolas"/>
-          <w:sz w:val="16"/>
-        </w:rPr>
-        <w:t>GET  /api/products            -&gt; 4 products remain (id 7 removed)</w:t>
-      </w:r>
-      <w:r>
-        <w:br/>
-      </w:r>
-      <w:r>
-        <w:rPr>
-          <w:rFonts w:ascii="Consolas" w:hAnsi="Consolas"/>
-          <w:sz w:val="16"/>
-        </w:rPr>
-      </w:r>
-      <w:r>
-        <w:br/>
-      </w:r>
-      <w:r>
-        <w:rPr>
-          <w:rFonts w:ascii="Consolas" w:hAnsi="Consolas"/>
-          <w:sz w:val="16"/>
-        </w:rPr>
-        <w:t>Cross-origin (CORS) check - request header Origin: http://localhost:5174</w:t>
-      </w:r>
-      <w:r>
-        <w:br/>
-      </w:r>
-      <w:r>
-        <w:rPr>
-          <w:rFonts w:ascii="Consolas" w:hAnsi="Consolas"/>
-          <w:sz w:val="16"/>
-        </w:rPr>
-        <w:t>Access-Control-Allow-Origin: http://localhost:5174   (HTTP/1.1 200)</w:t>
-      </w:r>
-    </w:p>
-    <w:p>
-      <w:pPr>
-        <w:spacing w:after="120"/>
-      </w:pPr>
-      <w:r>
-        <w:rPr>
-          <w:rFonts w:ascii="Calibri" w:hAnsi="Calibri"/>
-        </w:rPr>
-        <w:t>Every HTTP method behaved as specified: GET lists products, GET /{id} returns one product, POST creates, PUT updates and DELETE removes the row, all persisted in the kluh.products MySQL table.</w:t>
-      </w:r>
-    </w:p>
-    <w:p>
-      <w:pPr>
-        <w:pStyle w:val="Heading1"/>
-      </w:pPr>
-      <w:r>
-        <w:t>7. Front End (ReactJS)</w:t>
-      </w:r>
-    </w:p>
-    <w:p>
-      <w:pPr>
-        <w:pStyle w:val="Heading2"/>
-      </w:pPr>
-      <w:r>
-        <w:t>7.1 Creating the Project</w:t>
-      </w:r>
-    </w:p>
-    <w:p>
-      <w:pPr>
-        <w:spacing w:after="120"/>
-      </w:pPr>
-      <w:r>
-        <w:rPr>
-          <w:rFonts w:ascii="Calibri" w:hAnsi="Calibri"/>
-        </w:rPr>
-        <w:t>A Vite React project was created from the reference steps:</w:t>
-      </w:r>
-    </w:p>
-    <w:p>
-      <w:pPr>
-        <w:spacing w:before="40" w:after="120"/>
-      </w:pPr>
-      <w:r>
-        <w:rPr>
-          <w:rFonts w:ascii="Consolas" w:hAnsi="Consolas"/>
-          <w:sz w:val="16"/>
-        </w:rPr>
-        <w:t>D:\dbms\frontend&gt; npm create vite@latest week9p            (template: react)</w:t>
-      </w:r>
-      <w:r>
-        <w:br/>
-      </w:r>
-      <w:r>
-        <w:rPr>
-          <w:rFonts w:ascii="Consolas" w:hAnsi="Consolas"/>
-          <w:sz w:val="16"/>
-        </w:rPr>
-        <w:t>D:\dbms\frontend\week9p&gt; npm install</w:t>
-      </w:r>
-      <w:r>
-        <w:br/>
-      </w:r>
-      <w:r>
-        <w:rPr>
-          <w:rFonts w:ascii="Consolas" w:hAnsi="Consolas"/>
-          <w:sz w:val="16"/>
-        </w:rPr>
-        <w:t>D:\dbms\frontend\week9p&gt; npm install axios</w:t>
-      </w:r>
-      <w:r>
-        <w:br/>
-      </w:r>
-      <w:r>
-        <w:rPr>
-          <w:rFonts w:ascii="Consolas" w:hAnsi="Consolas"/>
-          <w:sz w:val="16"/>
-        </w:rPr>
-        <w:t>D:\dbms\frontend\week9p&gt; npm install react-router-dom</w:t>
-      </w:r>
-    </w:p>
-    <w:p>
-      <w:pPr>
-        <w:spacing w:after="120"/>
-      </w:pPr>
-      <w:r>
-        <w:rPr>
-          <w:rFonts w:ascii="Calibri" w:hAnsi="Calibri"/>
-        </w:rPr>
-        <w:t>Project structure:</w:t>
-      </w:r>
-    </w:p>
-    <w:p>
-      <w:pPr>
-        <w:spacing w:before="40" w:after="120"/>
-      </w:pPr>
-      <w:r>
-        <w:rPr>
-          <w:rFonts w:ascii="Consolas" w:hAnsi="Consolas"/>
-          <w:sz w:val="16"/>
-        </w:rPr>
-        <w:t>frontend (week9p)</w:t>
-      </w:r>
-      <w:r>
-        <w:br/>
-      </w:r>
-      <w:r>
-        <w:rPr>
-          <w:rFonts w:ascii="Consolas" w:hAnsi="Consolas"/>
-          <w:sz w:val="16"/>
-        </w:rPr>
-        <w:t xml:space="preserve"> |--- src/</w:t>
-      </w:r>
-      <w:r>
-        <w:br/>
-      </w:r>
-      <w:r>
-        <w:rPr>
-          <w:rFonts w:ascii="Consolas" w:hAnsi="Consolas"/>
-          <w:sz w:val="16"/>
-        </w:rPr>
-        <w:t xml:space="preserve">      |--- components/</w:t>
-      </w:r>
-      <w:r>
-        <w:br/>
-      </w:r>
-      <w:r>
-        <w:rPr>
-          <w:rFonts w:ascii="Consolas" w:hAnsi="Consolas"/>
-          <w:sz w:val="16"/>
-        </w:rPr>
-        <w:t xml:space="preserve">      |     |--- ProductList.jsx</w:t>
-      </w:r>
-      <w:r>
-        <w:br/>
-      </w:r>
-      <w:r>
-        <w:rPr>
-          <w:rFonts w:ascii="Consolas" w:hAnsi="Consolas"/>
-          <w:sz w:val="16"/>
-        </w:rPr>
-        <w:t xml:space="preserve">      |     |--- AddProduct.jsx</w:t>
-      </w:r>
-      <w:r>
-        <w:br/>
-      </w:r>
-      <w:r>
-        <w:rPr>
-          <w:rFonts w:ascii="Consolas" w:hAnsi="Consolas"/>
-          <w:sz w:val="16"/>
-        </w:rPr>
-        <w:t xml:space="preserve">      |     |--- UpdateProduct.jsx</w:t>
-      </w:r>
-      <w:r>
-        <w:br/>
-      </w:r>
-      <w:r>
-        <w:rPr>
-          <w:rFonts w:ascii="Consolas" w:hAnsi="Consolas"/>
-          <w:sz w:val="16"/>
-        </w:rPr>
-        <w:t xml:space="preserve">      |     |--- DeleteProduct.jsx</w:t>
-      </w:r>
-      <w:r>
-        <w:br/>
-      </w:r>
-      <w:r>
-        <w:rPr>
-          <w:rFonts w:ascii="Consolas" w:hAnsi="Consolas"/>
-          <w:sz w:val="16"/>
-        </w:rPr>
-        <w:t xml:space="preserve">      |--- services/</w:t>
-      </w:r>
-      <w:r>
-        <w:br/>
-      </w:r>
-      <w:r>
-        <w:rPr>
-          <w:rFonts w:ascii="Consolas" w:hAnsi="Consolas"/>
-          <w:sz w:val="16"/>
-        </w:rPr>
-        <w:t xml:space="preserve">      |     |--- productService.jsx</w:t>
-      </w:r>
-      <w:r>
-        <w:br/>
-      </w:r>
-      <w:r>
-        <w:rPr>
-          <w:rFonts w:ascii="Consolas" w:hAnsi="Consolas"/>
-          <w:sz w:val="16"/>
-        </w:rPr>
-        <w:t xml:space="preserve">      |--- App.jsx</w:t>
-      </w:r>
-    </w:p>
-    <w:p>
-      <w:pPr>
-        <w:pStyle w:val="Heading2"/>
-      </w:pPr>
-      <w:r>
-        <w:t>7.2 productService.jsx</w:t>
-      </w:r>
-    </w:p>
-    <w:p>
-      <w:pPr>
-        <w:spacing w:after="120"/>
-      </w:pPr>
-      <w:r>
-        <w:rPr>
-          <w:rFonts w:ascii="Calibri" w:hAnsi="Calibri"/>
-        </w:rPr>
-        <w:t>Axios is used to call the Spring Boot API (port 8090 in this session; the reference uses 8080):</w:t>
-      </w:r>
-    </w:p>
-    <w:p>
-      <w:pPr>
-        <w:spacing w:before="40" w:after="120"/>
-      </w:pPr>
-      <w:r>
-        <w:rPr>
-          <w:rFonts w:ascii="Consolas" w:hAnsi="Consolas"/>
-          <w:sz w:val="16"/>
-        </w:rPr>
-        <w:t>import axios from 'axios';</w:t>
-      </w:r>
-      <w:r>
-        <w:br/>
-      </w:r>
-      <w:r>
-        <w:rPr>
-          <w:rFonts w:ascii="Consolas" w:hAnsi="Consolas"/>
-          <w:sz w:val="16"/>
-        </w:rPr>
-        <w:t>const API_URL = "http://localhost:8090/api/products";</w:t>
-      </w:r>
-      <w:r>
-        <w:br/>
-      </w:r>
-      <w:r>
-        <w:rPr>
-          <w:rFonts w:ascii="Consolas" w:hAnsi="Consolas"/>
-          <w:sz w:val="16"/>
-        </w:rPr>
-        <w:t>export const getAllProducts = () =&gt; axios.get(API_URL);</w:t>
-      </w:r>
-      <w:r>
-        <w:br/>
-      </w:r>
-      <w:r>
-        <w:rPr>
-          <w:rFonts w:ascii="Consolas" w:hAnsi="Consolas"/>
-          <w:sz w:val="16"/>
-        </w:rPr>
-        <w:t>export const addProduct      = (product) =&gt; axios.post(API_URL, product);</w:t>
-      </w:r>
-      <w:r>
-        <w:br/>
-      </w:r>
-      <w:r>
-        <w:rPr>
-          <w:rFonts w:ascii="Consolas" w:hAnsi="Consolas"/>
-          <w:sz w:val="16"/>
-        </w:rPr>
-        <w:t>export const updateProduct   = (id, product) =&gt; axios.put(`${API_URL}/${id}`, product);</w:t>
-      </w:r>
-      <w:r>
-        <w:br/>
-      </w:r>
-      <w:r>
-        <w:rPr>
-          <w:rFonts w:ascii="Consolas" w:hAnsi="Consolas"/>
-          <w:sz w:val="16"/>
-        </w:rPr>
-        <w:t>export const deleteProduct   = (id) =&gt; axios.delete(`${API_URL}/${id}`);</w:t>
-      </w:r>
-    </w:p>
-    <w:p>
-      <w:pPr>
-        <w:pStyle w:val="Heading2"/>
-      </w:pPr>
-      <w:r>
-        <w:t>7.3 Components</w:t>
-      </w:r>
-    </w:p>
-    <w:p>
-      <w:pPr>
-        <w:spacing w:after="120"/>
-      </w:pPr>
-      <w:r>
-        <w:rPr>
-          <w:rFonts w:ascii="Calibri" w:hAnsi="Calibri"/>
-        </w:rPr>
-        <w:t>ProductList.jsx loads all products with getAllProducts() in useEffect and deletes one with deleteProduct(). AddProduct.jsx holds the form state and submits with addProduct(). UpdateProduct.jsx reads the id from the route with useParams(), loads the product, and saves the changes with updateProduct(). DeleteProduct.jsx asks for confirmation and calls deleteProduct(). The code matches the reference implementation.</w:t>
-      </w:r>
-    </w:p>
-    <w:p>
-      <w:pPr>
-        <w:spacing w:before="40" w:after="120"/>
-      </w:pPr>
-      <w:r>
-        <w:rPr>
-          <w:rFonts w:ascii="Consolas" w:hAnsi="Consolas"/>
-          <w:sz w:val="16"/>
-        </w:rPr>
-        <w:t>const ProductList = () =&gt; {</w:t>
-      </w:r>
-      <w:r>
-        <w:br/>
-      </w:r>
-      <w:r>
-        <w:rPr>
-          <w:rFonts w:ascii="Consolas" w:hAnsi="Consolas"/>
-          <w:sz w:val="16"/>
-        </w:rPr>
-        <w:t xml:space="preserve">    const [products, setProducts] = useState([]);</w:t>
-      </w:r>
-      <w:r>
-        <w:br/>
-      </w:r>
-      <w:r>
-        <w:rPr>
-          <w:rFonts w:ascii="Consolas" w:hAnsi="Consolas"/>
-          <w:sz w:val="16"/>
-        </w:rPr>
-        <w:t xml:space="preserve">    useEffect(() =&gt; { getAllProducts().then(r =&gt; setProducts(r.data)); }, []);</w:t>
-      </w:r>
-      <w:r>
-        <w:br/>
-      </w:r>
-      <w:r>
-        <w:rPr>
-          <w:rFonts w:ascii="Consolas" w:hAnsi="Consolas"/>
-          <w:sz w:val="16"/>
-        </w:rPr>
-        <w:t xml:space="preserve">    const handleDelete = (id) =&gt; deleteProduct(id).then(() =&gt;</w:t>
-      </w:r>
-      <w:r>
-        <w:br/>
-      </w:r>
-      <w:r>
-        <w:rPr>
-          <w:rFonts w:ascii="Consolas" w:hAnsi="Consolas"/>
-          <w:sz w:val="16"/>
-        </w:rPr>
-        <w:t xml:space="preserve">        setProducts(products.filter(p =&gt; p.id !== id)));</w:t>
-      </w:r>
-      <w:r>
-        <w:br/>
-      </w:r>
-      <w:r>
-        <w:rPr>
-          <w:rFonts w:ascii="Consolas" w:hAnsi="Consolas"/>
-          <w:sz w:val="16"/>
-        </w:rPr>
-        <w:t xml:space="preserve">    return &lt;div&gt;&lt;h2&gt;Product List&lt;/h2&gt;</w:t>
-      </w:r>
-      <w:r>
-        <w:br/>
-      </w:r>
-      <w:r>
-        <w:rPr>
-          <w:rFonts w:ascii="Consolas" w:hAnsi="Consolas"/>
-          <w:sz w:val="16"/>
-        </w:rPr>
-        <w:t xml:space="preserve">        &lt;ul&gt;{products.map(p =&gt; &lt;li key={p.id}&gt;{p.name} - ${p.price}</w:t>
-      </w:r>
-      <w:r>
-        <w:br/>
-      </w:r>
-      <w:r>
-        <w:rPr>
-          <w:rFonts w:ascii="Consolas" w:hAnsi="Consolas"/>
-          <w:sz w:val="16"/>
-        </w:rPr>
-        <w:t xml:space="preserve">            &lt;button onClick={() =&gt; handleDelete(p.id)}&gt;Delete&lt;/button&gt;&lt;/li&gt;)}&lt;/ul&gt;&lt;/div&gt;;</w:t>
-      </w:r>
-      <w:r>
-        <w:br/>
-      </w:r>
-      <w:r>
-        <w:rPr>
-          <w:rFonts w:ascii="Consolas" w:hAnsi="Consolas"/>
-          <w:sz w:val="16"/>
-        </w:rPr>
-        <w:t>};</w:t>
-      </w:r>
-      <w:r>
-        <w:br/>
-      </w:r>
-      <w:r>
-        <w:rPr>
-          <w:rFonts w:ascii="Consolas" w:hAnsi="Consolas"/>
-          <w:sz w:val="16"/>
-        </w:rPr>
-        <w:t>export default ProductList;</w:t>
-      </w:r>
-    </w:p>
-    <w:p>
-      <w:pPr>
-        <w:pStyle w:val="Heading2"/>
-      </w:pPr>
-      <w:r>
-        <w:t>7.4 App.jsx (Routing)</w:t>
-      </w:r>
-    </w:p>
-    <w:p>
-      <w:pPr>
-        <w:spacing w:before="40" w:after="120"/>
-      </w:pPr>
-      <w:r>
-        <w:rPr>
-          <w:rFonts w:ascii="Consolas" w:hAnsi="Consolas"/>
-          <w:sz w:val="16"/>
-        </w:rPr>
-        <w:t>import { BrowserRouter as Router, Routes, Route } from "react-router-dom";</w:t>
-      </w:r>
-      <w:r>
-        <w:br/>
-      </w:r>
-      <w:r>
-        <w:rPr>
-          <w:rFonts w:ascii="Consolas" w:hAnsi="Consolas"/>
-          <w:sz w:val="16"/>
-        </w:rPr>
-        <w:t>&lt;Router&gt;</w:t>
-      </w:r>
-      <w:r>
-        <w:br/>
-      </w:r>
-      <w:r>
-        <w:rPr>
-          <w:rFonts w:ascii="Consolas" w:hAnsi="Consolas"/>
-          <w:sz w:val="16"/>
-        </w:rPr>
-        <w:t xml:space="preserve">  &lt;Routes&gt;</w:t>
-      </w:r>
-      <w:r>
-        <w:br/>
-      </w:r>
-      <w:r>
-        <w:rPr>
-          <w:rFonts w:ascii="Consolas" w:hAnsi="Consolas"/>
-          <w:sz w:val="16"/>
-        </w:rPr>
-        <w:t xml:space="preserve">    &lt;Route path="/" element={&lt;ProductList /&gt;} /&gt;</w:t>
-      </w:r>
-      <w:r>
-        <w:br/>
-      </w:r>
-      <w:r>
-        <w:rPr>
-          <w:rFonts w:ascii="Consolas" w:hAnsi="Consolas"/>
-          <w:sz w:val="16"/>
-        </w:rPr>
-        <w:t xml:space="preserve">    &lt;Route path="/add" element={&lt;AddProduct /&gt;} /&gt;</w:t>
-      </w:r>
-      <w:r>
-        <w:br/>
-      </w:r>
-      <w:r>
-        <w:rPr>
-          <w:rFonts w:ascii="Consolas" w:hAnsi="Consolas"/>
-          <w:sz w:val="16"/>
-        </w:rPr>
-        <w:t xml:space="preserve">    &lt;Route path="/update/:id" element={&lt;UpdateProduct /&gt;} /&gt;</w:t>
-      </w:r>
-      <w:r>
-        <w:br/>
-      </w:r>
-      <w:r>
-        <w:rPr>
-          <w:rFonts w:ascii="Consolas" w:hAnsi="Consolas"/>
-          <w:sz w:val="16"/>
-        </w:rPr>
-        <w:t xml:space="preserve">    &lt;Route path="/delete/:id" element={&lt;DeleteProduct /&gt;} /&gt;</w:t>
-      </w:r>
-      <w:r>
-        <w:br/>
-      </w:r>
-      <w:r>
-        <w:rPr>
-          <w:rFonts w:ascii="Consolas" w:hAnsi="Consolas"/>
-          <w:sz w:val="16"/>
-        </w:rPr>
-        <w:t xml:space="preserve">  &lt;/Routes&gt;</w:t>
-      </w:r>
-      <w:r>
-        <w:br/>
-      </w:r>
-      <w:r>
-        <w:rPr>
-          <w:rFonts w:ascii="Consolas" w:hAnsi="Consolas"/>
-          <w:sz w:val="16"/>
-        </w:rPr>
-        <w:t>&lt;/Router&gt;</w:t>
-      </w:r>
-    </w:p>
-    <w:p>
-      <w:pPr>
-        <w:pStyle w:val="Heading2"/>
-      </w:pPr>
-      <w:r>
-        <w:t>7.5 Running the Front End (Real Log)</w:t>
-      </w:r>
-    </w:p>
-    <w:p>
-      <w:pPr>
-        <w:spacing w:after="120"/>
-      </w:pPr>
-      <w:r>
-        <w:rPr>
-          <w:rFonts w:ascii="Calibri" w:hAnsi="Calibri"/>
-        </w:rPr>
-        <w:t>npm run dev started the Vite dev server. Because port 5173 is occupied by Docker Desktop on this machine, Vite automatically used port 5174 (real log: vite_dev_week7.log):</w:t>
-      </w:r>
-    </w:p>
-    <w:p>
-      <w:pPr>
-        <w:spacing w:before="40" w:after="120"/>
-      </w:pPr>
-      <w:r>
-        <w:rPr>
-          <w:rFonts w:ascii="Consolas" w:hAnsi="Consolas"/>
-          <w:sz w:val="16"/>
-        </w:rPr>
-        <w:t>&gt; week9p@0.0.0 dev</w:t>
-      </w:r>
-      <w:r>
-        <w:br/>
-      </w:r>
-      <w:r>
-        <w:rPr>
-          <w:rFonts w:ascii="Consolas" w:hAnsi="Consolas"/>
-          <w:sz w:val="16"/>
-        </w:rPr>
-        <w:t>&gt; vite</w:t>
-      </w:r>
-      <w:r>
-        <w:br/>
-      </w:r>
-      <w:r>
-        <w:rPr>
-          <w:rFonts w:ascii="Consolas" w:hAnsi="Consolas"/>
-          <w:sz w:val="16"/>
-        </w:rPr>
-        <w:t>Port 5173 is in use, trying another one...</w:t>
-      </w:r>
-      <w:r>
-        <w:br/>
-      </w:r>
-      <w:r>
-        <w:rPr>
-          <w:rFonts w:ascii="Consolas" w:hAnsi="Consolas"/>
-          <w:sz w:val="16"/>
-        </w:rPr>
-        <w:t>VITE v8.3.0  ready in 1489 ms</w:t>
-      </w:r>
-      <w:r>
-        <w:br/>
-      </w:r>
-      <w:r>
-        <w:rPr>
-          <w:rFonts w:ascii="Consolas" w:hAnsi="Consolas"/>
-          <w:sz w:val="16"/>
-        </w:rPr>
-        <w:t>Local: http://localhost:5174/</w:t>
-      </w:r>
-      <w:r>
-        <w:br/>
-      </w:r>
-      <w:r>
-        <w:rPr>
-          <w:rFonts w:ascii="Consolas" w:hAnsi="Consolas"/>
-          <w:sz w:val="16"/>
-        </w:rPr>
-        <w:t>press h + enter to show help</w:t>
-      </w:r>
-    </w:p>
-    <w:p>
-      <w:pPr>
-        <w:spacing w:after="120"/>
-      </w:pPr>
-      <w:r>
-        <w:rPr>
-          <w:rFonts w:ascii="Calibri" w:hAnsi="Calibri"/>
-        </w:rPr>
-        <w:t>curl of http://localhost:5174/ returned the React application HTML (index.html served by Vite). The rendered pages load the product data from the Spring Boot API through productService.jsx; the CORS header Access-Control-Allow-Origin: http://localhost:5174 on the API responses confirms the browser integration path is enabled.</w:t>
-      </w:r>
-    </w:p>
-    <w:p>
-      <w:pPr>
-        <w:pStyle w:val="Heading1"/>
-      </w:pPr>
-      <w:r>
-        <w:t>8. Result</w:t>
-      </w:r>
-    </w:p>
-    <w:p>
-      <w:pPr>
-        <w:spacing w:after="120"/>
-      </w:pPr>
-      <w:r>
-        <w:rPr>
-          <w:rFonts w:ascii="Calibri" w:hAnsi="Calibri"/>
-        </w:rPr>
-        <w:t>The Spring Boot back end (Model &gt; Repository &gt; Service &gt; Controller) was created, connected to the MySQL database kluh and started with the embedded server on port 8090. The ReactJS front end (Vite + React, axios, react-router-dom) was created and started on port 5174. The full CRUD flow was executed for real: adding a product (POST) created rows 5-7 in MySQL, updating (PUT) changed the price and quantity of product 1, and deleting (DELETE) removed product 7. The cross-origin check returned Access-Control-Allow-Origin: http://localhost:5174, proving that the React application can communicate with the Spring Boot API.</w:t>
-      </w:r>
-    </w:p>
-    <w:p>
-      <w:pPr>
-        <w:pStyle w:val="Heading1"/>
-      </w:pPr>
-      <w:r>
-        <w:t>9. Conclusion</w:t>
-      </w:r>
-    </w:p>
-    <w:p>
-      <w:pPr>
-        <w:spacing w:after="120"/>
-      </w:pPr>
-      <w:r>
-        <w:rPr>
-          <w:rFonts w:ascii="Calibri" w:hAnsi="Calibri"/>
-        </w:rPr>
-        <w:t>This practical demonstrated full-stack integration: a ReactJS front end communicates over REST (axios) with a Spring Boot back end that uses Spring Web MVC and Spring Data JPA to persist products in a MySQL database. The layered architecture (controller - service - repository) with constructor-based injection keeps the responsibilities separate, and @CrossOrigin connects the two sides. The verified REST API and browser-facing CORS behaviour confirm that the Spring Boot + ReactJS CRUD integration works end to end.</w:t>
+        <w:t>This practical integrated the complete stack learned across the course: a ReactJS front end consuming a Spring Boot REST backend with axios, and a MySQL database accessed with Spring Data JPA. The @Entity, @Repository (JpaRepository), @RestController and @CrossOrigin annotations link the three tiers, and ddl-auto: update lets JPA manage the schema. The same three-tier architecture is reused in the Week-8 FastAPI practical in different technology, showing how the REST and CRUD concepts transfer across stacks.</w:t>
       </w:r>
     </w:p>
     <w:sectPr>
+      <w:footerReference w:type="default" r:id="rId12"/>
       <w:pgSz w:w="12240" w:h="15840"/>
-      <w:pgMar w:top="1440" w:right="1800" w:bottom="1440" w:left="1800" w:header="720" w:footer="720" w:gutter="0"/>
+      <w:pgMar w:top="1296" w:right="1440" w:bottom="1296" w:left="1440" w:header="720" w:footer="720" w:gutter="0"/>
       <w:cols w:space="720"/>
       <w:docGrid w:linePitch="360"/>
     </w:sectPr>
   </w:body>
 </w:document>
+</file>
+
+<file path=word/footer1.xml><?xml version="1.0" encoding="utf-8"?>
+<w:ftr xmlns:m="http://schemas.openxmlformats.org/officeDocument/2006/math" xmlns:mc="http://schemas.openxmlformats.org/markup-compatibility/2006" xmlns:mo="http://schemas.microsoft.com/office/mac/office/2008/main" xmlns:mv="urn:schemas-microsoft-com:mac:vml" xmlns:o="urn:schemas-microsoft-com:office:office" xmlns:r="http://schemas.openxmlformats.org/officeDocument/2006/relationships" xmlns:v="urn:schemas-microsoft-com:vml" xmlns:w10="urn:schemas-microsoft-com:office:word" xmlns:w14="http://schemas.microsoft.com/office/word/2010/wordml" xmlns:w="http://schemas.openxmlformats.org/wordprocessingml/2006/main" xmlns:wne="http://schemas.microsoft.com/office/word/2006/wordml" xmlns:wp14="http://schemas.microsoft.com/office/word/2010/wordprocessingDrawing" xmlns:wp="http://schemas.openxmlformats.org/drawingml/2006/wordprocessingDrawing" xmlns:wpc="http://schemas.microsoft.com/office/word/2010/wordprocessingCanvas" xmlns:wpg="http://schemas.microsoft.com/office/word/2010/wordprocessingGroup" xmlns:wpi="http://schemas.microsoft.com/office/word/2010/wordprocessingInk" xmlns:wps="http://schemas.microsoft.com/office/word/2010/wordprocessingShape" mc:Ignorable="w14 wp14">
+  <w:p>
+    <w:pPr>
+      <w:pStyle w:val="Footer"/>
+      <w:jc w:val="center"/>
+    </w:pPr>
+    <w:r>
+      <w:rPr>
+        <w:color w:val="666666"/>
+        <w:sz w:val="18"/>
+      </w:rPr>
+      <w:t xml:space="preserve">KARKALA SHIVA REDDY | 2520030105 | KL UNIVERSITY | Week-7 DB-DS Practical    |    Page </w:t>
+    </w:r>
+    <w:fldSimple w:instr="PAGE">
+      <w:r>
+        <w:rPr>
+          <w:sz w:val="18"/>
+        </w:rPr>
+        <w:t>1</w:t>
+      </w:r>
+    </w:fldSimple>
+  </w:p>
+</w:ftr>
 </file>
 
 <file path=word/numbering.xml><?xml version="1.0" encoding="utf-8"?>
@@ -2883,6 +3187,9 @@
     <w:name w:val="Normal"/>
     <w:qFormat/>
     <w:rsid w:val="00FC693F"/>
+    <w:pPr>
+      <w:spacing w:after="120" w:line="276" w:lineRule="auto"/>
+    </w:pPr>
     <w:rPr>
       <w:rFonts w:ascii="Calibri" w:hAnsi="Calibri"/>
       <w:sz w:val="22"/>
@@ -2947,11 +3254,11 @@
       <w:outlineLvl w:val="0"/>
     </w:pPr>
     <w:rPr>
-      <w:rFonts w:asciiTheme="majorHAnsi" w:eastAsiaTheme="majorEastAsia" w:hAnsiTheme="majorHAnsi" w:cstheme="majorBidi"/>
+      <w:rFonts w:asciiTheme="majorHAnsi" w:eastAsiaTheme="majorEastAsia" w:hAnsiTheme="majorHAnsi" w:cstheme="majorBidi" w:ascii="Calibri" w:hAnsi="Calibri"/>
       <w:b/>
       <w:bCs/>
-      <w:color w:val="365F91" w:themeColor="accent1" w:themeShade="BF"/>
-      <w:sz w:val="28"/>
+      <w:color w:val="1F3B63"/>
+      <w:sz w:val="32"/>
       <w:szCs w:val="28"/>
     </w:rPr>
   </w:style>
@@ -2971,10 +3278,10 @@
       <w:outlineLvl w:val="1"/>
     </w:pPr>
     <w:rPr>
-      <w:rFonts w:asciiTheme="majorHAnsi" w:eastAsiaTheme="majorEastAsia" w:hAnsiTheme="majorHAnsi" w:cstheme="majorBidi"/>
+      <w:rFonts w:asciiTheme="majorHAnsi" w:eastAsiaTheme="majorEastAsia" w:hAnsiTheme="majorHAnsi" w:cstheme="majorBidi" w:ascii="Calibri" w:hAnsi="Calibri"/>
       <w:b/>
       <w:bCs/>
-      <w:color w:val="4F81BD" w:themeColor="accent1"/>
+      <w:color w:val="1F3B63"/>
       <w:sz w:val="26"/>
       <w:szCs w:val="26"/>
     </w:rPr>
@@ -2995,10 +3302,11 @@
       <w:outlineLvl w:val="2"/>
     </w:pPr>
     <w:rPr>
-      <w:rFonts w:asciiTheme="majorHAnsi" w:eastAsiaTheme="majorEastAsia" w:hAnsiTheme="majorHAnsi" w:cstheme="majorBidi"/>
+      <w:rFonts w:asciiTheme="majorHAnsi" w:eastAsiaTheme="majorEastAsia" w:hAnsiTheme="majorHAnsi" w:cstheme="majorBidi" w:ascii="Calibri" w:hAnsi="Calibri"/>
       <w:b/>
       <w:bCs/>
-      <w:color w:val="4F81BD" w:themeColor="accent1"/>
+      <w:color w:val="1F3B63"/>
+      <w:sz w:val="23"/>
     </w:rPr>
   </w:style>
   <w:style w:type="paragraph" w:styleId="Heading4">

</xml_diff>